<commit_message>
Clear sticker frames: thick black outline per sticker, solid inner lines
Co-Authored-By: Claude Opus 5.5 <noreply@anthropic.com>
Claude-Session: https://claude.ai/code/session_01YBdjy2TecHFsv2WWXqxQZ5
</commit_message>
<xml_diff>
--- a/tools/payment-stickers/naklejky.docx
+++ b/tools/payment-stickers/naklejky.docx
@@ -30,7 +30,7 @@
           <w:sz w:val="18"/>
           <w:szCs w:val="18"/>
         </w:rPr>
-        <w:t xml:space="preserve">Кожна клітинка — один логотип 40 × 40 мм. Жирна чорна рамка — одна наклейка (вирізається разом); пунктир — межа між логотипами всередині наклейки. Щоб перегрупувати: змініть, де жирні лінії (Конструктор таблиць → Межі). Сірий номер у куточку відповідає таблиці «яка каса — що клеїти». Логотипи схематичні: правою кнопкою → Змінити рисунок.</w:t>
+        <w:t xml:space="preserve">Кожна клітинка — один логотип 40 × 40 мм. Жирна чорна рамка — одна наклейка (вирізається разом); тонка сіра лінія — межа між логотипами всередині наклейки. Щоб перегрупувати: змініть, де жирні лінії (Конструктор таблиць → Межі). Сірий номер у куточку відповідає таблиці «яка каса — що клеїти». Логотипи схематичні: правою кнопкою → Змінити рисунок.</w:t>
       </w:r>
     </w:p>
     <w:tbl>
@@ -66,7 +66,7 @@
             <w:tcBorders>
               <w:top w:val="single" w:color="000000" w:sz="48"/>
               <w:left w:val="single" w:color="000000" w:sz="48"/>
-              <w:bottom w:val="dotted" w:color="C8CDD2" w:sz="4"/>
+              <w:bottom w:val="single" w:color="555D66" w:sz="8"/>
               <w:right w:val="single" w:color="000000" w:sz="48"/>
             </w:tcBorders>
             <w:shd w:fill="7BA23A" w:color="auto" w:val="clear"/>
@@ -109,7 +109,7 @@
             <w:tcBorders>
               <w:top w:val="single" w:color="000000" w:sz="48"/>
               <w:left w:val="single" w:color="000000" w:sz="48"/>
-              <w:bottom w:val="dotted" w:color="C8CDD2" w:sz="4"/>
+              <w:bottom w:val="single" w:color="555D66" w:sz="8"/>
               <w:right w:val="single" w:color="000000" w:sz="48"/>
             </w:tcBorders>
             <w:shd w:fill="7BA23A" w:color="auto" w:val="clear"/>
@@ -155,10 +155,10 @@
           <w:tcPr>
             <w:tcW w:type="dxa" w:w="2268"/>
             <w:tcBorders>
-              <w:top w:val="dotted" w:color="C8CDD2" w:sz="4"/>
+              <w:top w:val="single" w:color="555D66" w:sz="8"/>
               <w:left w:val="single" w:color="000000" w:sz="48"/>
               <w:bottom w:val="single" w:color="000000" w:sz="48"/>
-              <w:right w:val="dotted" w:color="C8CDD2" w:sz="4"/>
+              <w:right w:val="single" w:color="555D66" w:sz="8"/>
             </w:tcBorders>
             <w:tcMar>
               <w:top w:type="dxa" w:w="0"/>
@@ -236,10 +236,10 @@
           <w:tcPr>
             <w:tcW w:type="dxa" w:w="2268"/>
             <w:tcBorders>
-              <w:top w:val="dotted" w:color="C8CDD2" w:sz="4"/>
-              <w:left w:val="dotted" w:color="C8CDD2" w:sz="4"/>
+              <w:top w:val="single" w:color="555D66" w:sz="8"/>
+              <w:left w:val="single" w:color="555D66" w:sz="8"/>
               <w:bottom w:val="single" w:color="000000" w:sz="48"/>
-              <w:right w:val="dotted" w:color="C8CDD2" w:sz="4"/>
+              <w:right w:val="single" w:color="555D66" w:sz="8"/>
             </w:tcBorders>
             <w:tcMar>
               <w:top w:type="dxa" w:w="0"/>
@@ -300,8 +300,8 @@
           <w:tcPr>
             <w:tcW w:type="dxa" w:w="2268"/>
             <w:tcBorders>
-              <w:top w:val="dotted" w:color="C8CDD2" w:sz="4"/>
-              <w:left w:val="dotted" w:color="C8CDD2" w:sz="4"/>
+              <w:top w:val="single" w:color="555D66" w:sz="8"/>
+              <w:left w:val="single" w:color="555D66" w:sz="8"/>
               <w:bottom w:val="single" w:color="000000" w:sz="48"/>
               <w:right w:val="single" w:color="000000" w:sz="48"/>
             </w:tcBorders>
@@ -364,10 +364,10 @@
           <w:tcPr>
             <w:tcW w:type="dxa" w:w="2268"/>
             <w:tcBorders>
-              <w:top w:val="dotted" w:color="C8CDD2" w:sz="4"/>
+              <w:top w:val="single" w:color="555D66" w:sz="8"/>
               <w:left w:val="single" w:color="000000" w:sz="48"/>
               <w:bottom w:val="single" w:color="000000" w:sz="48"/>
-              <w:right w:val="dotted" w:color="C8CDD2" w:sz="4"/>
+              <w:right w:val="single" w:color="555D66" w:sz="8"/>
             </w:tcBorders>
             <w:tcMar>
               <w:top w:type="dxa" w:w="0"/>
@@ -445,10 +445,10 @@
           <w:tcPr>
             <w:tcW w:type="dxa" w:w="2268"/>
             <w:tcBorders>
-              <w:top w:val="dotted" w:color="C8CDD2" w:sz="4"/>
-              <w:left w:val="dotted" w:color="C8CDD2" w:sz="4"/>
+              <w:top w:val="single" w:color="555D66" w:sz="8"/>
+              <w:left w:val="single" w:color="555D66" w:sz="8"/>
               <w:bottom w:val="single" w:color="000000" w:sz="48"/>
-              <w:right w:val="dotted" w:color="C8CDD2" w:sz="4"/>
+              <w:right w:val="single" w:color="555D66" w:sz="8"/>
             </w:tcBorders>
             <w:tcMar>
               <w:top w:type="dxa" w:w="0"/>
@@ -509,8 +509,8 @@
           <w:tcPr>
             <w:tcW w:type="dxa" w:w="2268"/>
             <w:tcBorders>
-              <w:top w:val="dotted" w:color="C8CDD2" w:sz="4"/>
-              <w:left w:val="dotted" w:color="C8CDD2" w:sz="4"/>
+              <w:top w:val="single" w:color="555D66" w:sz="8"/>
+              <w:left w:val="single" w:color="555D66" w:sz="8"/>
               <w:bottom w:val="single" w:color="000000" w:sz="48"/>
               <w:right w:val="single" w:color="000000" w:sz="48"/>
             </w:tcBorders>
@@ -582,7 +582,7 @@
             <w:tcBorders>
               <w:top w:val="single" w:color="000000" w:sz="48"/>
               <w:left w:val="single" w:color="000000" w:sz="48"/>
-              <w:bottom w:val="dotted" w:color="C8CDD2" w:sz="4"/>
+              <w:bottom w:val="single" w:color="555D66" w:sz="8"/>
               <w:right w:val="single" w:color="000000" w:sz="48"/>
             </w:tcBorders>
             <w:shd w:fill="7BA23A" w:color="auto" w:val="clear"/>
@@ -625,7 +625,7 @@
               <w:top w:val="single" w:color="000000" w:sz="48"/>
               <w:left w:val="single" w:color="000000" w:sz="48"/>
               <w:bottom w:val="none" w:color="FFFFFF" w:sz="0"/>
-              <w:right w:val="dotted" w:color="C8CDD2" w:sz="4"/>
+              <w:right w:val="none" w:color="FFFFFF" w:sz="0"/>
             </w:tcBorders>
           </w:tcPr>
           <w:p>
@@ -639,9 +639,9 @@
             <w:tcW w:type="dxa" w:w="2268"/>
             <w:tcBorders>
               <w:top w:val="single" w:color="000000" w:sz="48"/>
-              <w:left w:val="dotted" w:color="C8CDD2" w:sz="4"/>
+              <w:left w:val="none" w:color="FFFFFF" w:sz="0"/>
               <w:bottom w:val="none" w:color="FFFFFF" w:sz="0"/>
-              <w:right w:val="dotted" w:color="C8CDD2" w:sz="4"/>
+              <w:right w:val="none" w:color="FFFFFF" w:sz="0"/>
             </w:tcBorders>
           </w:tcPr>
           <w:p>
@@ -655,7 +655,7 @@
             <w:tcW w:type="dxa" w:w="2268"/>
             <w:tcBorders>
               <w:top w:val="single" w:color="000000" w:sz="48"/>
-              <w:left w:val="dotted" w:color="C8CDD2" w:sz="4"/>
+              <w:left w:val="none" w:color="FFFFFF" w:sz="0"/>
               <w:bottom w:val="none" w:color="FFFFFF" w:sz="0"/>
               <w:right w:val="single" w:color="000000" w:sz="48"/>
             </w:tcBorders>
@@ -676,10 +676,10 @@
           <w:tcPr>
             <w:tcW w:type="dxa" w:w="2268"/>
             <w:tcBorders>
-              <w:top w:val="dotted" w:color="C8CDD2" w:sz="4"/>
+              <w:top w:val="single" w:color="555D66" w:sz="8"/>
               <w:left w:val="single" w:color="000000" w:sz="48"/>
-              <w:bottom w:val="dotted" w:color="C8CDD2" w:sz="4"/>
-              <w:right w:val="dotted" w:color="C8CDD2" w:sz="4"/>
+              <w:bottom w:val="single" w:color="555D66" w:sz="8"/>
+              <w:right w:val="single" w:color="555D66" w:sz="8"/>
             </w:tcBorders>
             <w:tcMar>
               <w:top w:type="dxa" w:w="0"/>
@@ -757,10 +757,10 @@
           <w:tcPr>
             <w:tcW w:type="dxa" w:w="2268"/>
             <w:tcBorders>
-              <w:top w:val="dotted" w:color="C8CDD2" w:sz="4"/>
-              <w:left w:val="dotted" w:color="C8CDD2" w:sz="4"/>
-              <w:bottom w:val="dotted" w:color="C8CDD2" w:sz="4"/>
-              <w:right w:val="dotted" w:color="C8CDD2" w:sz="4"/>
+              <w:top w:val="single" w:color="555D66" w:sz="8"/>
+              <w:left w:val="single" w:color="555D66" w:sz="8"/>
+              <w:bottom w:val="single" w:color="555D66" w:sz="8"/>
+              <w:right w:val="single" w:color="555D66" w:sz="8"/>
             </w:tcBorders>
             <w:tcMar>
               <w:top w:type="dxa" w:w="0"/>
@@ -821,9 +821,9 @@
           <w:tcPr>
             <w:tcW w:type="dxa" w:w="2268"/>
             <w:tcBorders>
-              <w:top w:val="dotted" w:color="C8CDD2" w:sz="4"/>
-              <w:left w:val="dotted" w:color="C8CDD2" w:sz="4"/>
-              <w:bottom w:val="dotted" w:color="C8CDD2" w:sz="4"/>
+              <w:top w:val="single" w:color="555D66" w:sz="8"/>
+              <w:left w:val="single" w:color="555D66" w:sz="8"/>
+              <w:bottom w:val="single" w:color="555D66" w:sz="8"/>
               <w:right w:val="single" w:color="000000" w:sz="48"/>
             </w:tcBorders>
             <w:tcMar>
@@ -887,8 +887,8 @@
             <w:tcBorders>
               <w:top w:val="none" w:color="FFFFFF" w:sz="0"/>
               <w:left w:val="single" w:color="000000" w:sz="48"/>
-              <w:bottom w:val="dotted" w:color="C8CDD2" w:sz="4"/>
-              <w:right w:val="dotted" w:color="C8CDD2" w:sz="4"/>
+              <w:bottom w:val="single" w:color="555D66" w:sz="8"/>
+              <w:right w:val="single" w:color="555D66" w:sz="8"/>
             </w:tcBorders>
             <w:tcMar>
               <w:top w:type="dxa" w:w="0"/>
@@ -967,9 +967,9 @@
             <w:tcW w:type="dxa" w:w="2268"/>
             <w:tcBorders>
               <w:top w:val="none" w:color="FFFFFF" w:sz="0"/>
-              <w:left w:val="dotted" w:color="C8CDD2" w:sz="4"/>
-              <w:bottom w:val="dotted" w:color="C8CDD2" w:sz="4"/>
-              <w:right w:val="dotted" w:color="C8CDD2" w:sz="4"/>
+              <w:left w:val="single" w:color="555D66" w:sz="8"/>
+              <w:bottom w:val="single" w:color="555D66" w:sz="8"/>
+              <w:right w:val="single" w:color="555D66" w:sz="8"/>
             </w:tcBorders>
             <w:tcMar>
               <w:top w:type="dxa" w:w="0"/>
@@ -1031,8 +1031,8 @@
             <w:tcW w:type="dxa" w:w="2268"/>
             <w:tcBorders>
               <w:top w:val="none" w:color="FFFFFF" w:sz="0"/>
-              <w:left w:val="dotted" w:color="C8CDD2" w:sz="4"/>
-              <w:bottom w:val="dotted" w:color="C8CDD2" w:sz="4"/>
+              <w:left w:val="single" w:color="555D66" w:sz="8"/>
+              <w:bottom w:val="single" w:color="555D66" w:sz="8"/>
               <w:right w:val="single" w:color="000000" w:sz="48"/>
             </w:tcBorders>
             <w:tcMar>
@@ -1100,10 +1100,10 @@
           <w:tcPr>
             <w:tcW w:type="dxa" w:w="2268"/>
             <w:tcBorders>
-              <w:top w:val="dotted" w:color="C8CDD2" w:sz="4"/>
+              <w:top w:val="single" w:color="555D66" w:sz="8"/>
               <w:left w:val="single" w:color="000000" w:sz="48"/>
               <w:bottom w:val="single" w:color="000000" w:sz="48"/>
-              <w:right w:val="dotted" w:color="C8CDD2" w:sz="4"/>
+              <w:right w:val="single" w:color="555D66" w:sz="8"/>
             </w:tcBorders>
             <w:tcMar>
               <w:top w:type="dxa" w:w="0"/>
@@ -1164,10 +1164,10 @@
           <w:tcPr>
             <w:tcW w:type="dxa" w:w="2268"/>
             <w:tcBorders>
-              <w:top w:val="dotted" w:color="C8CDD2" w:sz="4"/>
-              <w:left w:val="dotted" w:color="C8CDD2" w:sz="4"/>
+              <w:top w:val="single" w:color="555D66" w:sz="8"/>
+              <w:left w:val="single" w:color="555D66" w:sz="8"/>
               <w:bottom w:val="single" w:color="000000" w:sz="48"/>
-              <w:right w:val="dotted" w:color="C8CDD2" w:sz="4"/>
+              <w:right w:val="single" w:color="555D66" w:sz="8"/>
             </w:tcBorders>
             <w:tcMar>
               <w:top w:type="dxa" w:w="0"/>
@@ -1228,8 +1228,8 @@
           <w:tcPr>
             <w:tcW w:type="dxa" w:w="2268"/>
             <w:tcBorders>
-              <w:top w:val="dotted" w:color="C8CDD2" w:sz="4"/>
-              <w:left w:val="dotted" w:color="C8CDD2" w:sz="4"/>
+              <w:top w:val="single" w:color="555D66" w:sz="8"/>
+              <w:left w:val="single" w:color="555D66" w:sz="8"/>
               <w:bottom w:val="single" w:color="000000" w:sz="48"/>
               <w:right w:val="single" w:color="000000" w:sz="48"/>
             </w:tcBorders>
@@ -1292,10 +1292,10 @@
           <w:tcPr>
             <w:tcW w:type="dxa" w:w="2268"/>
             <w:tcBorders>
-              <w:top w:val="dotted" w:color="C8CDD2" w:sz="4"/>
+              <w:top w:val="single" w:color="555D66" w:sz="8"/>
               <w:left w:val="single" w:color="000000" w:sz="48"/>
               <w:bottom w:val="single" w:color="000000" w:sz="48"/>
-              <w:right w:val="dotted" w:color="C8CDD2" w:sz="4"/>
+              <w:right w:val="single" w:color="555D66" w:sz="8"/>
             </w:tcBorders>
             <w:tcMar>
               <w:top w:type="dxa" w:w="0"/>
@@ -1356,10 +1356,10 @@
           <w:tcPr>
             <w:tcW w:type="dxa" w:w="2268"/>
             <w:tcBorders>
-              <w:top w:val="dotted" w:color="C8CDD2" w:sz="4"/>
-              <w:left w:val="dotted" w:color="C8CDD2" w:sz="4"/>
+              <w:top w:val="single" w:color="555D66" w:sz="8"/>
+              <w:left w:val="single" w:color="555D66" w:sz="8"/>
               <w:bottom w:val="single" w:color="000000" w:sz="48"/>
-              <w:right w:val="dotted" w:color="C8CDD2" w:sz="4"/>
+              <w:right w:val="single" w:color="555D66" w:sz="8"/>
             </w:tcBorders>
             <w:tcMar>
               <w:top w:type="dxa" w:w="0"/>
@@ -1420,8 +1420,8 @@
           <w:tcPr>
             <w:tcW w:type="dxa" w:w="2268"/>
             <w:tcBorders>
-              <w:top w:val="dotted" w:color="C8CDD2" w:sz="4"/>
-              <w:left w:val="dotted" w:color="C8CDD2" w:sz="4"/>
+              <w:top w:val="single" w:color="555D66" w:sz="8"/>
+              <w:left w:val="single" w:color="555D66" w:sz="8"/>
               <w:bottom w:val="single" w:color="000000" w:sz="48"/>
               <w:right w:val="single" w:color="000000" w:sz="48"/>
             </w:tcBorders>
@@ -2008,10 +2008,10 @@
           <w:tcPr>
             <w:tcW w:type="dxa" w:w="9000"/>
             <w:tcBorders>
-              <w:top w:val="dotted" w:color="C8CDD2" w:sz="4"/>
-              <w:left w:val="dotted" w:color="C8CDD2" w:sz="4"/>
-              <w:bottom w:val="dotted" w:color="C8CDD2" w:sz="4"/>
-              <w:right w:val="dotted" w:color="C8CDD2" w:sz="4"/>
+              <w:top w:val="single" w:color="555D66" w:sz="8"/>
+              <w:left w:val="single" w:color="555D66" w:sz="8"/>
+              <w:bottom w:val="single" w:color="555D66" w:sz="8"/>
+              <w:right w:val="single" w:color="555D66" w:sz="8"/>
             </w:tcBorders>
             <w:shd w:fill="E6EEDB" w:color="auto" w:val="clear"/>
             <w:tcMar>
@@ -2038,10 +2038,10 @@
           <w:tcPr>
             <w:tcW w:type="dxa" w:w="4200"/>
             <w:tcBorders>
-              <w:top w:val="dotted" w:color="C8CDD2" w:sz="4"/>
-              <w:left w:val="dotted" w:color="C8CDD2" w:sz="4"/>
-              <w:bottom w:val="dotted" w:color="C8CDD2" w:sz="4"/>
-              <w:right w:val="dotted" w:color="C8CDD2" w:sz="4"/>
+              <w:top w:val="single" w:color="555D66" w:sz="8"/>
+              <w:left w:val="single" w:color="555D66" w:sz="8"/>
+              <w:bottom w:val="single" w:color="555D66" w:sz="8"/>
+              <w:right w:val="single" w:color="555D66" w:sz="8"/>
             </w:tcBorders>
             <w:shd w:fill="E6EEDB" w:color="auto" w:val="clear"/>
             <w:tcMar>
@@ -2070,10 +2070,10 @@
           <w:tcPr>
             <w:tcW w:type="dxa" w:w="9000"/>
             <w:tcBorders>
-              <w:top w:val="dotted" w:color="C8CDD2" w:sz="4"/>
-              <w:left w:val="dotted" w:color="C8CDD2" w:sz="4"/>
-              <w:bottom w:val="dotted" w:color="C8CDD2" w:sz="4"/>
-              <w:right w:val="dotted" w:color="C8CDD2" w:sz="4"/>
+              <w:top w:val="single" w:color="555D66" w:sz="8"/>
+              <w:left w:val="single" w:color="555D66" w:sz="8"/>
+              <w:bottom w:val="single" w:color="555D66" w:sz="8"/>
+              <w:right w:val="single" w:color="555D66" w:sz="8"/>
             </w:tcBorders>
             <w:tcMar>
               <w:top w:type="dxa" w:w="50"/>
@@ -2099,10 +2099,10 @@
           <w:tcPr>
             <w:tcW w:type="dxa" w:w="4200"/>
             <w:tcBorders>
-              <w:top w:val="dotted" w:color="C8CDD2" w:sz="4"/>
-              <w:left w:val="dotted" w:color="C8CDD2" w:sz="4"/>
-              <w:bottom w:val="dotted" w:color="C8CDD2" w:sz="4"/>
-              <w:right w:val="dotted" w:color="C8CDD2" w:sz="4"/>
+              <w:top w:val="single" w:color="555D66" w:sz="8"/>
+              <w:left w:val="single" w:color="555D66" w:sz="8"/>
+              <w:bottom w:val="single" w:color="555D66" w:sz="8"/>
+              <w:right w:val="single" w:color="555D66" w:sz="8"/>
             </w:tcBorders>
             <w:tcMar>
               <w:top w:type="dxa" w:w="50"/>
@@ -2130,10 +2130,10 @@
           <w:tcPr>
             <w:tcW w:type="dxa" w:w="9000"/>
             <w:tcBorders>
-              <w:top w:val="dotted" w:color="C8CDD2" w:sz="4"/>
-              <w:left w:val="dotted" w:color="C8CDD2" w:sz="4"/>
-              <w:bottom w:val="dotted" w:color="C8CDD2" w:sz="4"/>
-              <w:right w:val="dotted" w:color="C8CDD2" w:sz="4"/>
+              <w:top w:val="single" w:color="555D66" w:sz="8"/>
+              <w:left w:val="single" w:color="555D66" w:sz="8"/>
+              <w:bottom w:val="single" w:color="555D66" w:sz="8"/>
+              <w:right w:val="single" w:color="555D66" w:sz="8"/>
             </w:tcBorders>
             <w:tcMar>
               <w:top w:type="dxa" w:w="50"/>
@@ -2159,10 +2159,10 @@
           <w:tcPr>
             <w:tcW w:type="dxa" w:w="4200"/>
             <w:tcBorders>
-              <w:top w:val="dotted" w:color="C8CDD2" w:sz="4"/>
-              <w:left w:val="dotted" w:color="C8CDD2" w:sz="4"/>
-              <w:bottom w:val="dotted" w:color="C8CDD2" w:sz="4"/>
-              <w:right w:val="dotted" w:color="C8CDD2" w:sz="4"/>
+              <w:top w:val="single" w:color="555D66" w:sz="8"/>
+              <w:left w:val="single" w:color="555D66" w:sz="8"/>
+              <w:bottom w:val="single" w:color="555D66" w:sz="8"/>
+              <w:right w:val="single" w:color="555D66" w:sz="8"/>
             </w:tcBorders>
             <w:tcMar>
               <w:top w:type="dxa" w:w="50"/>
@@ -2190,10 +2190,10 @@
           <w:tcPr>
             <w:tcW w:type="dxa" w:w="9000"/>
             <w:tcBorders>
-              <w:top w:val="dotted" w:color="C8CDD2" w:sz="4"/>
-              <w:left w:val="dotted" w:color="C8CDD2" w:sz="4"/>
-              <w:bottom w:val="dotted" w:color="C8CDD2" w:sz="4"/>
-              <w:right w:val="dotted" w:color="C8CDD2" w:sz="4"/>
+              <w:top w:val="single" w:color="555D66" w:sz="8"/>
+              <w:left w:val="single" w:color="555D66" w:sz="8"/>
+              <w:bottom w:val="single" w:color="555D66" w:sz="8"/>
+              <w:right w:val="single" w:color="555D66" w:sz="8"/>
             </w:tcBorders>
             <w:tcMar>
               <w:top w:type="dxa" w:w="50"/>
@@ -2219,10 +2219,10 @@
           <w:tcPr>
             <w:tcW w:type="dxa" w:w="4200"/>
             <w:tcBorders>
-              <w:top w:val="dotted" w:color="C8CDD2" w:sz="4"/>
-              <w:left w:val="dotted" w:color="C8CDD2" w:sz="4"/>
-              <w:bottom w:val="dotted" w:color="C8CDD2" w:sz="4"/>
-              <w:right w:val="dotted" w:color="C8CDD2" w:sz="4"/>
+              <w:top w:val="single" w:color="555D66" w:sz="8"/>
+              <w:left w:val="single" w:color="555D66" w:sz="8"/>
+              <w:bottom w:val="single" w:color="555D66" w:sz="8"/>
+              <w:right w:val="single" w:color="555D66" w:sz="8"/>
             </w:tcBorders>
             <w:tcMar>
               <w:top w:type="dxa" w:w="50"/>
@@ -2250,10 +2250,10 @@
           <w:tcPr>
             <w:tcW w:type="dxa" w:w="9000"/>
             <w:tcBorders>
-              <w:top w:val="dotted" w:color="C8CDD2" w:sz="4"/>
-              <w:left w:val="dotted" w:color="C8CDD2" w:sz="4"/>
-              <w:bottom w:val="dotted" w:color="C8CDD2" w:sz="4"/>
-              <w:right w:val="dotted" w:color="C8CDD2" w:sz="4"/>
+              <w:top w:val="single" w:color="555D66" w:sz="8"/>
+              <w:left w:val="single" w:color="555D66" w:sz="8"/>
+              <w:bottom w:val="single" w:color="555D66" w:sz="8"/>
+              <w:right w:val="single" w:color="555D66" w:sz="8"/>
             </w:tcBorders>
             <w:tcMar>
               <w:top w:type="dxa" w:w="50"/>
@@ -2279,10 +2279,10 @@
           <w:tcPr>
             <w:tcW w:type="dxa" w:w="4200"/>
             <w:tcBorders>
-              <w:top w:val="dotted" w:color="C8CDD2" w:sz="4"/>
-              <w:left w:val="dotted" w:color="C8CDD2" w:sz="4"/>
-              <w:bottom w:val="dotted" w:color="C8CDD2" w:sz="4"/>
-              <w:right w:val="dotted" w:color="C8CDD2" w:sz="4"/>
+              <w:top w:val="single" w:color="555D66" w:sz="8"/>
+              <w:left w:val="single" w:color="555D66" w:sz="8"/>
+              <w:bottom w:val="single" w:color="555D66" w:sz="8"/>
+              <w:right w:val="single" w:color="555D66" w:sz="8"/>
             </w:tcBorders>
             <w:tcMar>
               <w:top w:type="dxa" w:w="50"/>
@@ -2310,10 +2310,10 @@
           <w:tcPr>
             <w:tcW w:type="dxa" w:w="9000"/>
             <w:tcBorders>
-              <w:top w:val="dotted" w:color="C8CDD2" w:sz="4"/>
-              <w:left w:val="dotted" w:color="C8CDD2" w:sz="4"/>
-              <w:bottom w:val="dotted" w:color="C8CDD2" w:sz="4"/>
-              <w:right w:val="dotted" w:color="C8CDD2" w:sz="4"/>
+              <w:top w:val="single" w:color="555D66" w:sz="8"/>
+              <w:left w:val="single" w:color="555D66" w:sz="8"/>
+              <w:bottom w:val="single" w:color="555D66" w:sz="8"/>
+              <w:right w:val="single" w:color="555D66" w:sz="8"/>
             </w:tcBorders>
             <w:tcMar>
               <w:top w:type="dxa" w:w="50"/>
@@ -2339,10 +2339,10 @@
           <w:tcPr>
             <w:tcW w:type="dxa" w:w="4200"/>
             <w:tcBorders>
-              <w:top w:val="dotted" w:color="C8CDD2" w:sz="4"/>
-              <w:left w:val="dotted" w:color="C8CDD2" w:sz="4"/>
-              <w:bottom w:val="dotted" w:color="C8CDD2" w:sz="4"/>
-              <w:right w:val="dotted" w:color="C8CDD2" w:sz="4"/>
+              <w:top w:val="single" w:color="555D66" w:sz="8"/>
+              <w:left w:val="single" w:color="555D66" w:sz="8"/>
+              <w:bottom w:val="single" w:color="555D66" w:sz="8"/>
+              <w:right w:val="single" w:color="555D66" w:sz="8"/>
             </w:tcBorders>
             <w:tcMar>
               <w:top w:type="dxa" w:w="50"/>
@@ -2370,10 +2370,10 @@
           <w:tcPr>
             <w:tcW w:type="dxa" w:w="9000"/>
             <w:tcBorders>
-              <w:top w:val="dotted" w:color="C8CDD2" w:sz="4"/>
-              <w:left w:val="dotted" w:color="C8CDD2" w:sz="4"/>
-              <w:bottom w:val="dotted" w:color="C8CDD2" w:sz="4"/>
-              <w:right w:val="dotted" w:color="C8CDD2" w:sz="4"/>
+              <w:top w:val="single" w:color="555D66" w:sz="8"/>
+              <w:left w:val="single" w:color="555D66" w:sz="8"/>
+              <w:bottom w:val="single" w:color="555D66" w:sz="8"/>
+              <w:right w:val="single" w:color="555D66" w:sz="8"/>
             </w:tcBorders>
             <w:tcMar>
               <w:top w:type="dxa" w:w="50"/>
@@ -2399,10 +2399,10 @@
           <w:tcPr>
             <w:tcW w:type="dxa" w:w="4200"/>
             <w:tcBorders>
-              <w:top w:val="dotted" w:color="C8CDD2" w:sz="4"/>
-              <w:left w:val="dotted" w:color="C8CDD2" w:sz="4"/>
-              <w:bottom w:val="dotted" w:color="C8CDD2" w:sz="4"/>
-              <w:right w:val="dotted" w:color="C8CDD2" w:sz="4"/>
+              <w:top w:val="single" w:color="555D66" w:sz="8"/>
+              <w:left w:val="single" w:color="555D66" w:sz="8"/>
+              <w:bottom w:val="single" w:color="555D66" w:sz="8"/>
+              <w:right w:val="single" w:color="555D66" w:sz="8"/>
             </w:tcBorders>
             <w:tcMar>
               <w:top w:type="dxa" w:w="50"/>
@@ -2430,10 +2430,10 @@
           <w:tcPr>
             <w:tcW w:type="dxa" w:w="9000"/>
             <w:tcBorders>
-              <w:top w:val="dotted" w:color="C8CDD2" w:sz="4"/>
-              <w:left w:val="dotted" w:color="C8CDD2" w:sz="4"/>
-              <w:bottom w:val="dotted" w:color="C8CDD2" w:sz="4"/>
-              <w:right w:val="dotted" w:color="C8CDD2" w:sz="4"/>
+              <w:top w:val="single" w:color="555D66" w:sz="8"/>
+              <w:left w:val="single" w:color="555D66" w:sz="8"/>
+              <w:bottom w:val="single" w:color="555D66" w:sz="8"/>
+              <w:right w:val="single" w:color="555D66" w:sz="8"/>
             </w:tcBorders>
             <w:tcMar>
               <w:top w:type="dxa" w:w="50"/>
@@ -2459,10 +2459,10 @@
           <w:tcPr>
             <w:tcW w:type="dxa" w:w="4200"/>
             <w:tcBorders>
-              <w:top w:val="dotted" w:color="C8CDD2" w:sz="4"/>
-              <w:left w:val="dotted" w:color="C8CDD2" w:sz="4"/>
-              <w:bottom w:val="dotted" w:color="C8CDD2" w:sz="4"/>
-              <w:right w:val="dotted" w:color="C8CDD2" w:sz="4"/>
+              <w:top w:val="single" w:color="555D66" w:sz="8"/>
+              <w:left w:val="single" w:color="555D66" w:sz="8"/>
+              <w:bottom w:val="single" w:color="555D66" w:sz="8"/>
+              <w:right w:val="single" w:color="555D66" w:sz="8"/>
             </w:tcBorders>
             <w:tcMar>
               <w:top w:type="dxa" w:w="50"/>
@@ -2490,10 +2490,10 @@
           <w:tcPr>
             <w:tcW w:type="dxa" w:w="9000"/>
             <w:tcBorders>
-              <w:top w:val="dotted" w:color="C8CDD2" w:sz="4"/>
-              <w:left w:val="dotted" w:color="C8CDD2" w:sz="4"/>
-              <w:bottom w:val="dotted" w:color="C8CDD2" w:sz="4"/>
-              <w:right w:val="dotted" w:color="C8CDD2" w:sz="4"/>
+              <w:top w:val="single" w:color="555D66" w:sz="8"/>
+              <w:left w:val="single" w:color="555D66" w:sz="8"/>
+              <w:bottom w:val="single" w:color="555D66" w:sz="8"/>
+              <w:right w:val="single" w:color="555D66" w:sz="8"/>
             </w:tcBorders>
             <w:tcMar>
               <w:top w:type="dxa" w:w="50"/>
@@ -2519,10 +2519,10 @@
           <w:tcPr>
             <w:tcW w:type="dxa" w:w="4200"/>
             <w:tcBorders>
-              <w:top w:val="dotted" w:color="C8CDD2" w:sz="4"/>
-              <w:left w:val="dotted" w:color="C8CDD2" w:sz="4"/>
-              <w:bottom w:val="dotted" w:color="C8CDD2" w:sz="4"/>
-              <w:right w:val="dotted" w:color="C8CDD2" w:sz="4"/>
+              <w:top w:val="single" w:color="555D66" w:sz="8"/>
+              <w:left w:val="single" w:color="555D66" w:sz="8"/>
+              <w:bottom w:val="single" w:color="555D66" w:sz="8"/>
+              <w:right w:val="single" w:color="555D66" w:sz="8"/>
             </w:tcBorders>
             <w:tcMar>
               <w:top w:type="dxa" w:w="50"/>
@@ -2550,10 +2550,10 @@
           <w:tcPr>
             <w:tcW w:type="dxa" w:w="9000"/>
             <w:tcBorders>
-              <w:top w:val="dotted" w:color="C8CDD2" w:sz="4"/>
-              <w:left w:val="dotted" w:color="C8CDD2" w:sz="4"/>
-              <w:bottom w:val="dotted" w:color="C8CDD2" w:sz="4"/>
-              <w:right w:val="dotted" w:color="C8CDD2" w:sz="4"/>
+              <w:top w:val="single" w:color="555D66" w:sz="8"/>
+              <w:left w:val="single" w:color="555D66" w:sz="8"/>
+              <w:bottom w:val="single" w:color="555D66" w:sz="8"/>
+              <w:right w:val="single" w:color="555D66" w:sz="8"/>
             </w:tcBorders>
             <w:tcMar>
               <w:top w:type="dxa" w:w="50"/>
@@ -2579,10 +2579,10 @@
           <w:tcPr>
             <w:tcW w:type="dxa" w:w="4200"/>
             <w:tcBorders>
-              <w:top w:val="dotted" w:color="C8CDD2" w:sz="4"/>
-              <w:left w:val="dotted" w:color="C8CDD2" w:sz="4"/>
-              <w:bottom w:val="dotted" w:color="C8CDD2" w:sz="4"/>
-              <w:right w:val="dotted" w:color="C8CDD2" w:sz="4"/>
+              <w:top w:val="single" w:color="555D66" w:sz="8"/>
+              <w:left w:val="single" w:color="555D66" w:sz="8"/>
+              <w:bottom w:val="single" w:color="555D66" w:sz="8"/>
+              <w:right w:val="single" w:color="555D66" w:sz="8"/>
             </w:tcBorders>
             <w:tcMar>
               <w:top w:type="dxa" w:w="50"/>
@@ -2610,10 +2610,10 @@
           <w:tcPr>
             <w:tcW w:type="dxa" w:w="9000"/>
             <w:tcBorders>
-              <w:top w:val="dotted" w:color="C8CDD2" w:sz="4"/>
-              <w:left w:val="dotted" w:color="C8CDD2" w:sz="4"/>
-              <w:bottom w:val="dotted" w:color="C8CDD2" w:sz="4"/>
-              <w:right w:val="dotted" w:color="C8CDD2" w:sz="4"/>
+              <w:top w:val="single" w:color="555D66" w:sz="8"/>
+              <w:left w:val="single" w:color="555D66" w:sz="8"/>
+              <w:bottom w:val="single" w:color="555D66" w:sz="8"/>
+              <w:right w:val="single" w:color="555D66" w:sz="8"/>
             </w:tcBorders>
             <w:tcMar>
               <w:top w:type="dxa" w:w="50"/>
@@ -2639,10 +2639,10 @@
           <w:tcPr>
             <w:tcW w:type="dxa" w:w="4200"/>
             <w:tcBorders>
-              <w:top w:val="dotted" w:color="C8CDD2" w:sz="4"/>
-              <w:left w:val="dotted" w:color="C8CDD2" w:sz="4"/>
-              <w:bottom w:val="dotted" w:color="C8CDD2" w:sz="4"/>
-              <w:right w:val="dotted" w:color="C8CDD2" w:sz="4"/>
+              <w:top w:val="single" w:color="555D66" w:sz="8"/>
+              <w:left w:val="single" w:color="555D66" w:sz="8"/>
+              <w:bottom w:val="single" w:color="555D66" w:sz="8"/>
+              <w:right w:val="single" w:color="555D66" w:sz="8"/>
             </w:tcBorders>
             <w:tcMar>
               <w:top w:type="dxa" w:w="50"/>
@@ -2704,7 +2704,7 @@
           <w:sz w:val="18"/>
           <w:szCs w:val="18"/>
         </w:rPr>
-        <w:t xml:space="preserve">Кожна клітинка — один логотип 40 × 40 мм. Жирна чорна рамка — одна наклейка (вирізається разом); пунктир — межа між логотипами всередині наклейки. Щоб перегрупувати: змініть, де жирні лінії (Конструктор таблиць → Межі). Сірий номер у куточку відповідає таблиці «яка каса — що клеїти». Логотипи схематичні: правою кнопкою → Змінити рисунок.</w:t>
+        <w:t xml:space="preserve">Кожна клітинка — один логотип 40 × 40 мм. Жирна чорна рамка — одна наклейка (вирізається разом); тонка сіра лінія — межа між логотипами всередині наклейки. Щоб перегрупувати: змініть, де жирні лінії (Конструктор таблиць → Межі). Сірий номер у куточку відповідає таблиці «яка каса — що клеїти». Логотипи схематичні: правою кнопкою → Змінити рисунок.</w:t>
       </w:r>
     </w:p>
     <w:tbl>
@@ -2741,7 +2741,7 @@
             <w:tcBorders>
               <w:top w:val="single" w:color="000000" w:sz="48"/>
               <w:left w:val="single" w:color="000000" w:sz="48"/>
-              <w:bottom w:val="dotted" w:color="C8CDD2" w:sz="4"/>
+              <w:bottom w:val="single" w:color="555D66" w:sz="8"/>
               <w:right w:val="single" w:color="000000" w:sz="48"/>
             </w:tcBorders>
             <w:shd w:fill="7BA23A" w:color="auto" w:val="clear"/>
@@ -2784,7 +2784,7 @@
             <w:tcBorders>
               <w:top w:val="single" w:color="000000" w:sz="48"/>
               <w:left w:val="single" w:color="000000" w:sz="48"/>
-              <w:bottom w:val="dotted" w:color="C8CDD2" w:sz="4"/>
+              <w:bottom w:val="single" w:color="555D66" w:sz="8"/>
               <w:right w:val="single" w:color="000000" w:sz="48"/>
             </w:tcBorders>
             <w:shd w:fill="7BA23A" w:color="auto" w:val="clear"/>
@@ -2827,7 +2827,7 @@
             <w:tcBorders>
               <w:top w:val="single" w:color="000000" w:sz="48"/>
               <w:left w:val="single" w:color="000000" w:sz="48"/>
-              <w:bottom w:val="dotted" w:color="C8CDD2" w:sz="4"/>
+              <w:bottom w:val="single" w:color="555D66" w:sz="8"/>
               <w:right w:val="single" w:color="000000" w:sz="48"/>
             </w:tcBorders>
             <w:shd w:fill="7BA23A" w:color="auto" w:val="clear"/>
@@ -2873,10 +2873,10 @@
           <w:tcPr>
             <w:tcW w:type="dxa" w:w="2268"/>
             <w:tcBorders>
-              <w:top w:val="dotted" w:color="C8CDD2" w:sz="4"/>
+              <w:top w:val="single" w:color="555D66" w:sz="8"/>
               <w:left w:val="single" w:color="000000" w:sz="48"/>
               <w:bottom w:val="single" w:color="000000" w:sz="48"/>
-              <w:right w:val="dotted" w:color="C8CDD2" w:sz="4"/>
+              <w:right w:val="single" w:color="555D66" w:sz="8"/>
             </w:tcBorders>
             <w:tcMar>
               <w:top w:type="dxa" w:w="0"/>
@@ -2954,8 +2954,8 @@
           <w:tcPr>
             <w:tcW w:type="dxa" w:w="2268"/>
             <w:tcBorders>
-              <w:top w:val="dotted" w:color="C8CDD2" w:sz="4"/>
-              <w:left w:val="dotted" w:color="C8CDD2" w:sz="4"/>
+              <w:top w:val="single" w:color="555D66" w:sz="8"/>
+              <w:left w:val="single" w:color="555D66" w:sz="8"/>
               <w:bottom w:val="single" w:color="000000" w:sz="48"/>
               <w:right w:val="single" w:color="000000" w:sz="48"/>
             </w:tcBorders>
@@ -3018,10 +3018,10 @@
           <w:tcPr>
             <w:tcW w:type="dxa" w:w="2268"/>
             <w:tcBorders>
-              <w:top w:val="dotted" w:color="C8CDD2" w:sz="4"/>
+              <w:top w:val="single" w:color="555D66" w:sz="8"/>
               <w:left w:val="single" w:color="000000" w:sz="48"/>
               <w:bottom w:val="single" w:color="000000" w:sz="48"/>
-              <w:right w:val="dotted" w:color="C8CDD2" w:sz="4"/>
+              <w:right w:val="single" w:color="555D66" w:sz="8"/>
             </w:tcBorders>
             <w:tcMar>
               <w:top w:type="dxa" w:w="0"/>
@@ -3099,10 +3099,10 @@
           <w:tcPr>
             <w:tcW w:type="dxa" w:w="2268"/>
             <w:tcBorders>
-              <w:top w:val="dotted" w:color="C8CDD2" w:sz="4"/>
-              <w:left w:val="dotted" w:color="C8CDD2" w:sz="4"/>
+              <w:top w:val="single" w:color="555D66" w:sz="8"/>
+              <w:left w:val="single" w:color="555D66" w:sz="8"/>
               <w:bottom w:val="single" w:color="000000" w:sz="48"/>
-              <w:right w:val="dotted" w:color="C8CDD2" w:sz="4"/>
+              <w:right w:val="single" w:color="555D66" w:sz="8"/>
             </w:tcBorders>
             <w:tcMar>
               <w:top w:type="dxa" w:w="0"/>
@@ -3163,8 +3163,8 @@
           <w:tcPr>
             <w:tcW w:type="dxa" w:w="2268"/>
             <w:tcBorders>
-              <w:top w:val="dotted" w:color="C8CDD2" w:sz="4"/>
-              <w:left w:val="dotted" w:color="C8CDD2" w:sz="4"/>
+              <w:top w:val="single" w:color="555D66" w:sz="8"/>
+              <w:left w:val="single" w:color="555D66" w:sz="8"/>
               <w:bottom w:val="single" w:color="000000" w:sz="48"/>
               <w:right w:val="single" w:color="000000" w:sz="48"/>
             </w:tcBorders>
@@ -3227,10 +3227,10 @@
           <w:tcPr>
             <w:tcW w:type="dxa" w:w="2268"/>
             <w:tcBorders>
-              <w:top w:val="dotted" w:color="C8CDD2" w:sz="4"/>
+              <w:top w:val="single" w:color="555D66" w:sz="8"/>
               <w:left w:val="single" w:color="000000" w:sz="48"/>
               <w:bottom w:val="single" w:color="000000" w:sz="48"/>
-              <w:right w:val="dotted" w:color="C8CDD2" w:sz="4"/>
+              <w:right w:val="single" w:color="555D66" w:sz="8"/>
             </w:tcBorders>
             <w:tcMar>
               <w:top w:type="dxa" w:w="0"/>
@@ -3308,8 +3308,8 @@
           <w:tcPr>
             <w:tcW w:type="dxa" w:w="2268"/>
             <w:tcBorders>
-              <w:top w:val="dotted" w:color="C8CDD2" w:sz="4"/>
-              <w:left w:val="dotted" w:color="C8CDD2" w:sz="4"/>
+              <w:top w:val="single" w:color="555D66" w:sz="8"/>
+              <w:left w:val="single" w:color="555D66" w:sz="8"/>
               <w:bottom w:val="single" w:color="000000" w:sz="48"/>
               <w:right w:val="single" w:color="000000" w:sz="48"/>
             </w:tcBorders>
@@ -3381,7 +3381,7 @@
               <w:top w:val="single" w:color="000000" w:sz="48"/>
               <w:left w:val="single" w:color="000000" w:sz="48"/>
               <w:bottom w:val="single" w:color="000000" w:sz="48"/>
-              <w:right w:val="dotted" w:color="C8CDD2" w:sz="4"/>
+              <w:right w:val="single" w:color="555D66" w:sz="8"/>
             </w:tcBorders>
             <w:tcMar>
               <w:top w:type="dxa" w:w="0"/>
@@ -3460,9 +3460,9 @@
             <w:tcW w:type="dxa" w:w="2268"/>
             <w:tcBorders>
               <w:top w:val="single" w:color="000000" w:sz="48"/>
-              <w:left w:val="dotted" w:color="C8CDD2" w:sz="4"/>
+              <w:left w:val="single" w:color="555D66" w:sz="8"/>
               <w:bottom w:val="single" w:color="000000" w:sz="48"/>
-              <w:right w:val="dotted" w:color="C8CDD2" w:sz="4"/>
+              <w:right w:val="single" w:color="555D66" w:sz="8"/>
             </w:tcBorders>
             <w:tcMar>
               <w:top w:type="dxa" w:w="0"/>
@@ -3524,9 +3524,9 @@
             <w:tcW w:type="dxa" w:w="2268"/>
             <w:tcBorders>
               <w:top w:val="single" w:color="000000" w:sz="48"/>
-              <w:left w:val="dotted" w:color="C8CDD2" w:sz="4"/>
+              <w:left w:val="single" w:color="555D66" w:sz="8"/>
               <w:bottom w:val="single" w:color="000000" w:sz="48"/>
-              <w:right w:val="dotted" w:color="C8CDD2" w:sz="4"/>
+              <w:right w:val="single" w:color="555D66" w:sz="8"/>
             </w:tcBorders>
             <w:tcMar>
               <w:top w:type="dxa" w:w="0"/>
@@ -3588,9 +3588,9 @@
             <w:tcW w:type="dxa" w:w="2268"/>
             <w:tcBorders>
               <w:top w:val="single" w:color="000000" w:sz="48"/>
-              <w:left w:val="dotted" w:color="C8CDD2" w:sz="4"/>
+              <w:left w:val="single" w:color="555D66" w:sz="8"/>
               <w:bottom w:val="single" w:color="000000" w:sz="48"/>
-              <w:right w:val="dotted" w:color="C8CDD2" w:sz="4"/>
+              <w:right w:val="single" w:color="555D66" w:sz="8"/>
             </w:tcBorders>
             <w:tcMar>
               <w:top w:type="dxa" w:w="0"/>
@@ -3652,9 +3652,9 @@
             <w:tcW w:type="dxa" w:w="2268"/>
             <w:tcBorders>
               <w:top w:val="single" w:color="000000" w:sz="48"/>
-              <w:left w:val="dotted" w:color="C8CDD2" w:sz="4"/>
+              <w:left w:val="single" w:color="555D66" w:sz="8"/>
               <w:bottom w:val="single" w:color="000000" w:sz="48"/>
-              <w:right w:val="dotted" w:color="C8CDD2" w:sz="4"/>
+              <w:right w:val="single" w:color="555D66" w:sz="8"/>
             </w:tcBorders>
             <w:tcMar>
               <w:top w:type="dxa" w:w="0"/>
@@ -3716,7 +3716,7 @@
             <w:tcW w:type="dxa" w:w="2268"/>
             <w:tcBorders>
               <w:top w:val="single" w:color="000000" w:sz="48"/>
-              <w:left w:val="dotted" w:color="C8CDD2" w:sz="4"/>
+              <w:left w:val="single" w:color="555D66" w:sz="8"/>
               <w:bottom w:val="single" w:color="000000" w:sz="48"/>
               <w:right w:val="single" w:color="000000" w:sz="48"/>
             </w:tcBorders>
@@ -3868,8 +3868,8 @@
             <w:tcBorders>
               <w:top w:val="single" w:color="000000" w:sz="48"/>
               <w:left w:val="single" w:color="000000" w:sz="48"/>
-              <w:bottom w:val="dotted" w:color="C8CDD2" w:sz="4"/>
-              <w:right w:val="dotted" w:color="C8CDD2" w:sz="4"/>
+              <w:bottom w:val="single" w:color="555D66" w:sz="8"/>
+              <w:right w:val="single" w:color="555D66" w:sz="8"/>
             </w:tcBorders>
             <w:tcMar>
               <w:top w:type="dxa" w:w="0"/>
@@ -3948,9 +3948,9 @@
             <w:tcW w:type="dxa" w:w="2268"/>
             <w:tcBorders>
               <w:top w:val="single" w:color="000000" w:sz="48"/>
-              <w:left w:val="dotted" w:color="C8CDD2" w:sz="4"/>
-              <w:bottom w:val="dotted" w:color="C8CDD2" w:sz="4"/>
-              <w:right w:val="dotted" w:color="C8CDD2" w:sz="4"/>
+              <w:left w:val="single" w:color="555D66" w:sz="8"/>
+              <w:bottom w:val="single" w:color="555D66" w:sz="8"/>
+              <w:right w:val="single" w:color="555D66" w:sz="8"/>
             </w:tcBorders>
             <w:tcMar>
               <w:top w:type="dxa" w:w="0"/>
@@ -4012,8 +4012,8 @@
             <w:tcW w:type="dxa" w:w="2268"/>
             <w:tcBorders>
               <w:top w:val="single" w:color="000000" w:sz="48"/>
-              <w:left w:val="dotted" w:color="C8CDD2" w:sz="4"/>
-              <w:bottom w:val="dotted" w:color="C8CDD2" w:sz="4"/>
+              <w:left w:val="single" w:color="555D66" w:sz="8"/>
+              <w:bottom w:val="single" w:color="555D66" w:sz="8"/>
               <w:right w:val="single" w:color="000000" w:sz="48"/>
             </w:tcBorders>
             <w:tcMar>
@@ -4405,10 +4405,10 @@
           <w:tcPr>
             <w:tcW w:type="dxa" w:w="2268"/>
             <w:tcBorders>
-              <w:top w:val="dotted" w:color="C8CDD2" w:sz="4"/>
+              <w:top w:val="single" w:color="555D66" w:sz="8"/>
               <w:left w:val="single" w:color="000000" w:sz="48"/>
               <w:bottom w:val="single" w:color="000000" w:sz="48"/>
-              <w:right w:val="dotted" w:color="C8CDD2" w:sz="4"/>
+              <w:right w:val="single" w:color="555D66" w:sz="8"/>
             </w:tcBorders>
             <w:tcMar>
               <w:top w:type="dxa" w:w="0"/>
@@ -4469,10 +4469,10 @@
           <w:tcPr>
             <w:tcW w:type="dxa" w:w="2268"/>
             <w:tcBorders>
-              <w:top w:val="dotted" w:color="C8CDD2" w:sz="4"/>
-              <w:left w:val="dotted" w:color="C8CDD2" w:sz="4"/>
+              <w:top w:val="single" w:color="555D66" w:sz="8"/>
+              <w:left w:val="single" w:color="555D66" w:sz="8"/>
               <w:bottom w:val="single" w:color="000000" w:sz="48"/>
-              <w:right w:val="dotted" w:color="C8CDD2" w:sz="4"/>
+              <w:right w:val="single" w:color="555D66" w:sz="8"/>
             </w:tcBorders>
             <w:tcMar>
               <w:top w:type="dxa" w:w="0"/>
@@ -4533,8 +4533,8 @@
           <w:tcPr>
             <w:tcW w:type="dxa" w:w="2268"/>
             <w:tcBorders>
-              <w:top w:val="dotted" w:color="C8CDD2" w:sz="4"/>
-              <w:left w:val="dotted" w:color="C8CDD2" w:sz="4"/>
+              <w:top w:val="single" w:color="555D66" w:sz="8"/>
+              <w:left w:val="single" w:color="555D66" w:sz="8"/>
               <w:bottom w:val="single" w:color="000000" w:sz="48"/>
               <w:right w:val="single" w:color="000000" w:sz="48"/>
             </w:tcBorders>
@@ -4600,7 +4600,7 @@
               <w:top w:val="single" w:color="000000" w:sz="48"/>
               <w:left w:val="single" w:color="000000" w:sz="48"/>
               <w:bottom w:val="single" w:color="000000" w:sz="48"/>
-              <w:right w:val="dotted" w:color="C8CDD2" w:sz="4"/>
+              <w:right w:val="single" w:color="555D66" w:sz="8"/>
             </w:tcBorders>
             <w:tcMar>
               <w:top w:type="dxa" w:w="0"/>
@@ -4679,7 +4679,7 @@
             <w:tcW w:type="dxa" w:w="2268"/>
             <w:tcBorders>
               <w:top w:val="single" w:color="000000" w:sz="48"/>
-              <w:left w:val="dotted" w:color="C8CDD2" w:sz="4"/>
+              <w:left w:val="single" w:color="555D66" w:sz="8"/>
               <w:bottom w:val="single" w:color="000000" w:sz="48"/>
               <w:right w:val="single" w:color="000000" w:sz="48"/>
             </w:tcBorders>
@@ -4913,7 +4913,7 @@
               <w:top w:val="single" w:color="000000" w:sz="48"/>
               <w:left w:val="single" w:color="000000" w:sz="48"/>
               <w:bottom w:val="single" w:color="000000" w:sz="48"/>
-              <w:right w:val="dotted" w:color="C8CDD2" w:sz="4"/>
+              <w:right w:val="single" w:color="555D66" w:sz="8"/>
             </w:tcBorders>
             <w:tcMar>
               <w:top w:type="dxa" w:w="0"/>
@@ -4992,9 +4992,9 @@
             <w:tcW w:type="dxa" w:w="2268"/>
             <w:tcBorders>
               <w:top w:val="single" w:color="000000" w:sz="48"/>
-              <w:left w:val="dotted" w:color="C8CDD2" w:sz="4"/>
+              <w:left w:val="single" w:color="555D66" w:sz="8"/>
               <w:bottom w:val="single" w:color="000000" w:sz="48"/>
-              <w:right w:val="dotted" w:color="C8CDD2" w:sz="4"/>
+              <w:right w:val="single" w:color="555D66" w:sz="8"/>
             </w:tcBorders>
             <w:tcMar>
               <w:top w:type="dxa" w:w="0"/>
@@ -5056,9 +5056,9 @@
             <w:tcW w:type="dxa" w:w="2268"/>
             <w:tcBorders>
               <w:top w:val="single" w:color="000000" w:sz="48"/>
-              <w:left w:val="dotted" w:color="C8CDD2" w:sz="4"/>
+              <w:left w:val="single" w:color="555D66" w:sz="8"/>
               <w:bottom w:val="single" w:color="000000" w:sz="48"/>
-              <w:right w:val="dotted" w:color="C8CDD2" w:sz="4"/>
+              <w:right w:val="single" w:color="555D66" w:sz="8"/>
             </w:tcBorders>
             <w:tcMar>
               <w:top w:type="dxa" w:w="0"/>
@@ -5120,9 +5120,9 @@
             <w:tcW w:type="dxa" w:w="2268"/>
             <w:tcBorders>
               <w:top w:val="single" w:color="000000" w:sz="48"/>
-              <w:left w:val="dotted" w:color="C8CDD2" w:sz="4"/>
+              <w:left w:val="single" w:color="555D66" w:sz="8"/>
               <w:bottom w:val="single" w:color="000000" w:sz="48"/>
-              <w:right w:val="dotted" w:color="C8CDD2" w:sz="4"/>
+              <w:right w:val="single" w:color="555D66" w:sz="8"/>
             </w:tcBorders>
             <w:tcMar>
               <w:top w:type="dxa" w:w="0"/>
@@ -5184,7 +5184,7 @@
             <w:tcW w:type="dxa" w:w="2268"/>
             <w:tcBorders>
               <w:top w:val="single" w:color="000000" w:sz="48"/>
-              <w:left w:val="dotted" w:color="C8CDD2" w:sz="4"/>
+              <w:left w:val="single" w:color="555D66" w:sz="8"/>
               <w:bottom w:val="single" w:color="000000" w:sz="48"/>
               <w:right w:val="single" w:color="000000" w:sz="48"/>
             </w:tcBorders>
@@ -5472,7 +5472,7 @@
             <w:tcBorders>
               <w:top w:val="single" w:color="000000" w:sz="48"/>
               <w:left w:val="single" w:color="000000" w:sz="48"/>
-              <w:bottom w:val="dotted" w:color="C8CDD2" w:sz="4"/>
+              <w:bottom w:val="single" w:color="555D66" w:sz="8"/>
               <w:right w:val="single" w:color="000000" w:sz="48"/>
             </w:tcBorders>
             <w:shd w:fill="7BA23A" w:color="auto" w:val="clear"/>
@@ -5515,7 +5515,7 @@
             <w:tcBorders>
               <w:top w:val="single" w:color="000000" w:sz="48"/>
               <w:left w:val="single" w:color="000000" w:sz="48"/>
-              <w:bottom w:val="dotted" w:color="C8CDD2" w:sz="4"/>
+              <w:bottom w:val="single" w:color="555D66" w:sz="8"/>
               <w:right w:val="single" w:color="000000" w:sz="48"/>
             </w:tcBorders>
             <w:shd w:fill="7BA23A" w:color="auto" w:val="clear"/>
@@ -5558,7 +5558,7 @@
             <w:tcBorders>
               <w:top w:val="single" w:color="000000" w:sz="48"/>
               <w:left w:val="single" w:color="000000" w:sz="48"/>
-              <w:bottom w:val="dotted" w:color="C8CDD2" w:sz="4"/>
+              <w:bottom w:val="single" w:color="555D66" w:sz="8"/>
               <w:right w:val="single" w:color="000000" w:sz="48"/>
             </w:tcBorders>
             <w:shd w:fill="7BA23A" w:color="auto" w:val="clear"/>
@@ -5601,7 +5601,7 @@
             <w:tcBorders>
               <w:top w:val="single" w:color="000000" w:sz="48"/>
               <w:left w:val="single" w:color="000000" w:sz="48"/>
-              <w:bottom w:val="dotted" w:color="C8CDD2" w:sz="4"/>
+              <w:bottom w:val="single" w:color="555D66" w:sz="8"/>
               <w:right w:val="single" w:color="000000" w:sz="48"/>
             </w:tcBorders>
             <w:shd w:fill="7BA23A" w:color="auto" w:val="clear"/>
@@ -5647,10 +5647,10 @@
           <w:tcPr>
             <w:tcW w:type="dxa" w:w="2268"/>
             <w:tcBorders>
-              <w:top w:val="dotted" w:color="C8CDD2" w:sz="4"/>
+              <w:top w:val="single" w:color="555D66" w:sz="8"/>
               <w:left w:val="single" w:color="000000" w:sz="48"/>
               <w:bottom w:val="single" w:color="000000" w:sz="48"/>
-              <w:right w:val="dotted" w:color="C8CDD2" w:sz="4"/>
+              <w:right w:val="single" w:color="555D66" w:sz="8"/>
             </w:tcBorders>
             <w:tcMar>
               <w:top w:type="dxa" w:w="0"/>
@@ -5728,8 +5728,8 @@
           <w:tcPr>
             <w:tcW w:type="dxa" w:w="2268"/>
             <w:tcBorders>
-              <w:top w:val="dotted" w:color="C8CDD2" w:sz="4"/>
-              <w:left w:val="dotted" w:color="C8CDD2" w:sz="4"/>
+              <w:top w:val="single" w:color="555D66" w:sz="8"/>
+              <w:left w:val="single" w:color="555D66" w:sz="8"/>
               <w:bottom w:val="single" w:color="000000" w:sz="48"/>
               <w:right w:val="single" w:color="000000" w:sz="48"/>
             </w:tcBorders>
@@ -5792,10 +5792,10 @@
           <w:tcPr>
             <w:tcW w:type="dxa" w:w="2268"/>
             <w:tcBorders>
-              <w:top w:val="dotted" w:color="C8CDD2" w:sz="4"/>
+              <w:top w:val="single" w:color="555D66" w:sz="8"/>
               <w:left w:val="single" w:color="000000" w:sz="48"/>
-              <w:bottom w:val="dotted" w:color="C8CDD2" w:sz="4"/>
-              <w:right w:val="dotted" w:color="C8CDD2" w:sz="4"/>
+              <w:bottom w:val="single" w:color="555D66" w:sz="8"/>
+              <w:right w:val="single" w:color="555D66" w:sz="8"/>
             </w:tcBorders>
             <w:tcMar>
               <w:top w:type="dxa" w:w="0"/>
@@ -5873,10 +5873,10 @@
           <w:tcPr>
             <w:tcW w:type="dxa" w:w="2268"/>
             <w:tcBorders>
-              <w:top w:val="dotted" w:color="C8CDD2" w:sz="4"/>
-              <w:left w:val="dotted" w:color="C8CDD2" w:sz="4"/>
-              <w:bottom w:val="dotted" w:color="C8CDD2" w:sz="4"/>
-              <w:right w:val="dotted" w:color="C8CDD2" w:sz="4"/>
+              <w:top w:val="single" w:color="555D66" w:sz="8"/>
+              <w:left w:val="single" w:color="555D66" w:sz="8"/>
+              <w:bottom w:val="single" w:color="555D66" w:sz="8"/>
+              <w:right w:val="single" w:color="555D66" w:sz="8"/>
             </w:tcBorders>
             <w:tcMar>
               <w:top w:type="dxa" w:w="0"/>
@@ -5937,9 +5937,9 @@
           <w:tcPr>
             <w:tcW w:type="dxa" w:w="2268"/>
             <w:tcBorders>
-              <w:top w:val="dotted" w:color="C8CDD2" w:sz="4"/>
-              <w:left w:val="dotted" w:color="C8CDD2" w:sz="4"/>
-              <w:bottom w:val="dotted" w:color="C8CDD2" w:sz="4"/>
+              <w:top w:val="single" w:color="555D66" w:sz="8"/>
+              <w:left w:val="single" w:color="555D66" w:sz="8"/>
+              <w:bottom w:val="single" w:color="555D66" w:sz="8"/>
               <w:right w:val="single" w:color="000000" w:sz="48"/>
             </w:tcBorders>
             <w:tcMar>
@@ -6001,10 +6001,10 @@
           <w:tcPr>
             <w:tcW w:type="dxa" w:w="2268"/>
             <w:tcBorders>
-              <w:top w:val="dotted" w:color="C8CDD2" w:sz="4"/>
+              <w:top w:val="single" w:color="555D66" w:sz="8"/>
               <w:left w:val="single" w:color="000000" w:sz="48"/>
               <w:bottom w:val="single" w:color="000000" w:sz="48"/>
-              <w:right w:val="dotted" w:color="C8CDD2" w:sz="4"/>
+              <w:right w:val="single" w:color="555D66" w:sz="8"/>
             </w:tcBorders>
             <w:tcMar>
               <w:top w:type="dxa" w:w="0"/>
@@ -6082,10 +6082,10 @@
           <w:tcPr>
             <w:tcW w:type="dxa" w:w="2268"/>
             <w:tcBorders>
-              <w:top w:val="dotted" w:color="C8CDD2" w:sz="4"/>
-              <w:left w:val="dotted" w:color="C8CDD2" w:sz="4"/>
+              <w:top w:val="single" w:color="555D66" w:sz="8"/>
+              <w:left w:val="single" w:color="555D66" w:sz="8"/>
               <w:bottom w:val="single" w:color="000000" w:sz="48"/>
-              <w:right w:val="dotted" w:color="C8CDD2" w:sz="4"/>
+              <w:right w:val="single" w:color="555D66" w:sz="8"/>
             </w:tcBorders>
             <w:tcMar>
               <w:top w:type="dxa" w:w="0"/>
@@ -6146,8 +6146,8 @@
           <w:tcPr>
             <w:tcW w:type="dxa" w:w="2268"/>
             <w:tcBorders>
-              <w:top w:val="dotted" w:color="C8CDD2" w:sz="4"/>
-              <w:left w:val="dotted" w:color="C8CDD2" w:sz="4"/>
+              <w:top w:val="single" w:color="555D66" w:sz="8"/>
+              <w:left w:val="single" w:color="555D66" w:sz="8"/>
               <w:bottom w:val="single" w:color="000000" w:sz="48"/>
               <w:right w:val="single" w:color="000000" w:sz="48"/>
             </w:tcBorders>
@@ -6210,10 +6210,10 @@
           <w:tcPr>
             <w:tcW w:type="dxa" w:w="2268"/>
             <w:tcBorders>
-              <w:top w:val="dotted" w:color="C8CDD2" w:sz="4"/>
+              <w:top w:val="single" w:color="555D66" w:sz="8"/>
               <w:left w:val="single" w:color="000000" w:sz="48"/>
               <w:bottom w:val="single" w:color="000000" w:sz="48"/>
-              <w:right w:val="dotted" w:color="C8CDD2" w:sz="4"/>
+              <w:right w:val="single" w:color="555D66" w:sz="8"/>
             </w:tcBorders>
             <w:tcMar>
               <w:top w:type="dxa" w:w="0"/>
@@ -6291,10 +6291,10 @@
           <w:tcPr>
             <w:tcW w:type="dxa" w:w="2268"/>
             <w:tcBorders>
-              <w:top w:val="dotted" w:color="C8CDD2" w:sz="4"/>
-              <w:left w:val="dotted" w:color="C8CDD2" w:sz="4"/>
+              <w:top w:val="single" w:color="555D66" w:sz="8"/>
+              <w:left w:val="single" w:color="555D66" w:sz="8"/>
               <w:bottom w:val="single" w:color="000000" w:sz="48"/>
-              <w:right w:val="dotted" w:color="C8CDD2" w:sz="4"/>
+              <w:right w:val="single" w:color="555D66" w:sz="8"/>
             </w:tcBorders>
             <w:tcMar>
               <w:top w:type="dxa" w:w="0"/>
@@ -6355,10 +6355,10 @@
           <w:tcPr>
             <w:tcW w:type="dxa" w:w="2268"/>
             <w:tcBorders>
-              <w:top w:val="dotted" w:color="C8CDD2" w:sz="4"/>
-              <w:left w:val="dotted" w:color="C8CDD2" w:sz="4"/>
+              <w:top w:val="single" w:color="555D66" w:sz="8"/>
+              <w:left w:val="single" w:color="555D66" w:sz="8"/>
               <w:bottom w:val="single" w:color="000000" w:sz="48"/>
-              <w:right w:val="dotted" w:color="C8CDD2" w:sz="4"/>
+              <w:right w:val="single" w:color="555D66" w:sz="8"/>
             </w:tcBorders>
             <w:tcMar>
               <w:top w:type="dxa" w:w="0"/>
@@ -6419,10 +6419,10 @@
           <w:tcPr>
             <w:tcW w:type="dxa" w:w="2268"/>
             <w:tcBorders>
-              <w:top w:val="dotted" w:color="C8CDD2" w:sz="4"/>
-              <w:left w:val="dotted" w:color="C8CDD2" w:sz="4"/>
+              <w:top w:val="single" w:color="555D66" w:sz="8"/>
+              <w:left w:val="single" w:color="555D66" w:sz="8"/>
               <w:bottom w:val="single" w:color="000000" w:sz="48"/>
-              <w:right w:val="dotted" w:color="C8CDD2" w:sz="4"/>
+              <w:right w:val="single" w:color="555D66" w:sz="8"/>
             </w:tcBorders>
             <w:tcMar>
               <w:top w:type="dxa" w:w="0"/>
@@ -6483,8 +6483,8 @@
           <w:tcPr>
             <w:tcW w:type="dxa" w:w="2268"/>
             <w:tcBorders>
-              <w:top w:val="dotted" w:color="C8CDD2" w:sz="4"/>
-              <w:left w:val="dotted" w:color="C8CDD2" w:sz="4"/>
+              <w:top w:val="single" w:color="555D66" w:sz="8"/>
+              <w:left w:val="single" w:color="555D66" w:sz="8"/>
               <w:bottom w:val="single" w:color="000000" w:sz="48"/>
               <w:right w:val="single" w:color="000000" w:sz="48"/>
             </w:tcBorders>
@@ -6715,10 +6715,10 @@
           <w:tcPr>
             <w:tcW w:type="dxa" w:w="2268"/>
             <w:tcBorders>
-              <w:top w:val="dotted" w:color="C8CDD2" w:sz="4"/>
+              <w:top w:val="single" w:color="555D66" w:sz="8"/>
               <w:left w:val="single" w:color="000000" w:sz="48"/>
               <w:bottom w:val="single" w:color="000000" w:sz="48"/>
-              <w:right w:val="dotted" w:color="C8CDD2" w:sz="4"/>
+              <w:right w:val="single" w:color="555D66" w:sz="8"/>
             </w:tcBorders>
             <w:tcMar>
               <w:top w:type="dxa" w:w="0"/>
@@ -6779,10 +6779,10 @@
           <w:tcPr>
             <w:tcW w:type="dxa" w:w="2268"/>
             <w:tcBorders>
-              <w:top w:val="dotted" w:color="C8CDD2" w:sz="4"/>
-              <w:left w:val="dotted" w:color="C8CDD2" w:sz="4"/>
+              <w:top w:val="single" w:color="555D66" w:sz="8"/>
+              <w:left w:val="single" w:color="555D66" w:sz="8"/>
               <w:bottom w:val="single" w:color="000000" w:sz="48"/>
-              <w:right w:val="dotted" w:color="C8CDD2" w:sz="4"/>
+              <w:right w:val="single" w:color="555D66" w:sz="8"/>
             </w:tcBorders>
             <w:tcMar>
               <w:top w:type="dxa" w:w="0"/>
@@ -6843,8 +6843,8 @@
           <w:tcPr>
             <w:tcW w:type="dxa" w:w="2268"/>
             <w:tcBorders>
-              <w:top w:val="dotted" w:color="C8CDD2" w:sz="4"/>
-              <w:left w:val="dotted" w:color="C8CDD2" w:sz="4"/>
+              <w:top w:val="single" w:color="555D66" w:sz="8"/>
+              <w:left w:val="single" w:color="555D66" w:sz="8"/>
               <w:bottom w:val="single" w:color="000000" w:sz="48"/>
               <w:right w:val="single" w:color="000000" w:sz="48"/>
             </w:tcBorders>
@@ -7602,10 +7602,10 @@
           <w:tcPr>
             <w:tcW w:type="dxa" w:w="7000"/>
             <w:tcBorders>
-              <w:top w:val="dotted" w:color="C8CDD2" w:sz="4"/>
-              <w:left w:val="dotted" w:color="C8CDD2" w:sz="4"/>
-              <w:bottom w:val="dotted" w:color="C8CDD2" w:sz="4"/>
-              <w:right w:val="dotted" w:color="C8CDD2" w:sz="4"/>
+              <w:top w:val="single" w:color="555D66" w:sz="8"/>
+              <w:left w:val="single" w:color="555D66" w:sz="8"/>
+              <w:bottom w:val="single" w:color="555D66" w:sz="8"/>
+              <w:right w:val="single" w:color="555D66" w:sz="8"/>
             </w:tcBorders>
             <w:shd w:fill="E6EEDB" w:color="auto" w:val="clear"/>
             <w:tcMar>
@@ -7632,10 +7632,10 @@
           <w:tcPr>
             <w:tcW w:type="dxa" w:w="4200"/>
             <w:tcBorders>
-              <w:top w:val="dotted" w:color="C8CDD2" w:sz="4"/>
-              <w:left w:val="dotted" w:color="C8CDD2" w:sz="4"/>
-              <w:bottom w:val="dotted" w:color="C8CDD2" w:sz="4"/>
-              <w:right w:val="dotted" w:color="C8CDD2" w:sz="4"/>
+              <w:top w:val="single" w:color="555D66" w:sz="8"/>
+              <w:left w:val="single" w:color="555D66" w:sz="8"/>
+              <w:bottom w:val="single" w:color="555D66" w:sz="8"/>
+              <w:right w:val="single" w:color="555D66" w:sz="8"/>
             </w:tcBorders>
             <w:shd w:fill="E6EEDB" w:color="auto" w:val="clear"/>
             <w:tcMar>
@@ -7662,10 +7662,10 @@
           <w:tcPr>
             <w:tcW w:type="dxa" w:w="4200"/>
             <w:tcBorders>
-              <w:top w:val="dotted" w:color="C8CDD2" w:sz="4"/>
-              <w:left w:val="dotted" w:color="C8CDD2" w:sz="4"/>
-              <w:bottom w:val="dotted" w:color="C8CDD2" w:sz="4"/>
-              <w:right w:val="dotted" w:color="C8CDD2" w:sz="4"/>
+              <w:top w:val="single" w:color="555D66" w:sz="8"/>
+              <w:left w:val="single" w:color="555D66" w:sz="8"/>
+              <w:bottom w:val="single" w:color="555D66" w:sz="8"/>
+              <w:right w:val="single" w:color="555D66" w:sz="8"/>
             </w:tcBorders>
             <w:shd w:fill="E6EEDB" w:color="auto" w:val="clear"/>
             <w:tcMar>
@@ -7694,10 +7694,10 @@
           <w:tcPr>
             <w:tcW w:type="dxa" w:w="7000"/>
             <w:tcBorders>
-              <w:top w:val="dotted" w:color="C8CDD2" w:sz="4"/>
-              <w:left w:val="dotted" w:color="C8CDD2" w:sz="4"/>
-              <w:bottom w:val="dotted" w:color="C8CDD2" w:sz="4"/>
-              <w:right w:val="dotted" w:color="C8CDD2" w:sz="4"/>
+              <w:top w:val="single" w:color="555D66" w:sz="8"/>
+              <w:left w:val="single" w:color="555D66" w:sz="8"/>
+              <w:bottom w:val="single" w:color="555D66" w:sz="8"/>
+              <w:right w:val="single" w:color="555D66" w:sz="8"/>
             </w:tcBorders>
             <w:tcMar>
               <w:top w:type="dxa" w:w="60"/>
@@ -7723,10 +7723,10 @@
           <w:tcPr>
             <w:tcW w:type="dxa" w:w="4200"/>
             <w:tcBorders>
-              <w:top w:val="dotted" w:color="C8CDD2" w:sz="4"/>
-              <w:left w:val="dotted" w:color="C8CDD2" w:sz="4"/>
-              <w:bottom w:val="dotted" w:color="C8CDD2" w:sz="4"/>
-              <w:right w:val="dotted" w:color="C8CDD2" w:sz="4"/>
+              <w:top w:val="single" w:color="555D66" w:sz="8"/>
+              <w:left w:val="single" w:color="555D66" w:sz="8"/>
+              <w:bottom w:val="single" w:color="555D66" w:sz="8"/>
+              <w:right w:val="single" w:color="555D66" w:sz="8"/>
             </w:tcBorders>
             <w:tcMar>
               <w:top w:type="dxa" w:w="60"/>
@@ -7752,10 +7752,10 @@
           <w:tcPr>
             <w:tcW w:type="dxa" w:w="4200"/>
             <w:tcBorders>
-              <w:top w:val="dotted" w:color="C8CDD2" w:sz="4"/>
-              <w:left w:val="dotted" w:color="C8CDD2" w:sz="4"/>
-              <w:bottom w:val="dotted" w:color="C8CDD2" w:sz="4"/>
-              <w:right w:val="dotted" w:color="C8CDD2" w:sz="4"/>
+              <w:top w:val="single" w:color="555D66" w:sz="8"/>
+              <w:left w:val="single" w:color="555D66" w:sz="8"/>
+              <w:bottom w:val="single" w:color="555D66" w:sz="8"/>
+              <w:right w:val="single" w:color="555D66" w:sz="8"/>
             </w:tcBorders>
             <w:tcMar>
               <w:top w:type="dxa" w:w="60"/>
@@ -7783,10 +7783,10 @@
           <w:tcPr>
             <w:tcW w:type="dxa" w:w="7000"/>
             <w:tcBorders>
-              <w:top w:val="dotted" w:color="C8CDD2" w:sz="4"/>
-              <w:left w:val="dotted" w:color="C8CDD2" w:sz="4"/>
-              <w:bottom w:val="dotted" w:color="C8CDD2" w:sz="4"/>
-              <w:right w:val="dotted" w:color="C8CDD2" w:sz="4"/>
+              <w:top w:val="single" w:color="555D66" w:sz="8"/>
+              <w:left w:val="single" w:color="555D66" w:sz="8"/>
+              <w:bottom w:val="single" w:color="555D66" w:sz="8"/>
+              <w:right w:val="single" w:color="555D66" w:sz="8"/>
             </w:tcBorders>
             <w:tcMar>
               <w:top w:type="dxa" w:w="60"/>
@@ -7812,10 +7812,10 @@
           <w:tcPr>
             <w:tcW w:type="dxa" w:w="4200"/>
             <w:tcBorders>
-              <w:top w:val="dotted" w:color="C8CDD2" w:sz="4"/>
-              <w:left w:val="dotted" w:color="C8CDD2" w:sz="4"/>
-              <w:bottom w:val="dotted" w:color="C8CDD2" w:sz="4"/>
-              <w:right w:val="dotted" w:color="C8CDD2" w:sz="4"/>
+              <w:top w:val="single" w:color="555D66" w:sz="8"/>
+              <w:left w:val="single" w:color="555D66" w:sz="8"/>
+              <w:bottom w:val="single" w:color="555D66" w:sz="8"/>
+              <w:right w:val="single" w:color="555D66" w:sz="8"/>
             </w:tcBorders>
             <w:tcMar>
               <w:top w:type="dxa" w:w="60"/>
@@ -7841,10 +7841,10 @@
           <w:tcPr>
             <w:tcW w:type="dxa" w:w="4200"/>
             <w:tcBorders>
-              <w:top w:val="dotted" w:color="C8CDD2" w:sz="4"/>
-              <w:left w:val="dotted" w:color="C8CDD2" w:sz="4"/>
-              <w:bottom w:val="dotted" w:color="C8CDD2" w:sz="4"/>
-              <w:right w:val="dotted" w:color="C8CDD2" w:sz="4"/>
+              <w:top w:val="single" w:color="555D66" w:sz="8"/>
+              <w:left w:val="single" w:color="555D66" w:sz="8"/>
+              <w:bottom w:val="single" w:color="555D66" w:sz="8"/>
+              <w:right w:val="single" w:color="555D66" w:sz="8"/>
             </w:tcBorders>
             <w:tcMar>
               <w:top w:type="dxa" w:w="60"/>
@@ -7872,10 +7872,10 @@
           <w:tcPr>
             <w:tcW w:type="dxa" w:w="7000"/>
             <w:tcBorders>
-              <w:top w:val="dotted" w:color="C8CDD2" w:sz="4"/>
-              <w:left w:val="dotted" w:color="C8CDD2" w:sz="4"/>
-              <w:bottom w:val="dotted" w:color="C8CDD2" w:sz="4"/>
-              <w:right w:val="dotted" w:color="C8CDD2" w:sz="4"/>
+              <w:top w:val="single" w:color="555D66" w:sz="8"/>
+              <w:left w:val="single" w:color="555D66" w:sz="8"/>
+              <w:bottom w:val="single" w:color="555D66" w:sz="8"/>
+              <w:right w:val="single" w:color="555D66" w:sz="8"/>
             </w:tcBorders>
             <w:tcMar>
               <w:top w:type="dxa" w:w="60"/>
@@ -7901,10 +7901,10 @@
           <w:tcPr>
             <w:tcW w:type="dxa" w:w="4200"/>
             <w:tcBorders>
-              <w:top w:val="dotted" w:color="C8CDD2" w:sz="4"/>
-              <w:left w:val="dotted" w:color="C8CDD2" w:sz="4"/>
-              <w:bottom w:val="dotted" w:color="C8CDD2" w:sz="4"/>
-              <w:right w:val="dotted" w:color="C8CDD2" w:sz="4"/>
+              <w:top w:val="single" w:color="555D66" w:sz="8"/>
+              <w:left w:val="single" w:color="555D66" w:sz="8"/>
+              <w:bottom w:val="single" w:color="555D66" w:sz="8"/>
+              <w:right w:val="single" w:color="555D66" w:sz="8"/>
             </w:tcBorders>
             <w:tcMar>
               <w:top w:type="dxa" w:w="60"/>
@@ -7930,10 +7930,10 @@
           <w:tcPr>
             <w:tcW w:type="dxa" w:w="4200"/>
             <w:tcBorders>
-              <w:top w:val="dotted" w:color="C8CDD2" w:sz="4"/>
-              <w:left w:val="dotted" w:color="C8CDD2" w:sz="4"/>
-              <w:bottom w:val="dotted" w:color="C8CDD2" w:sz="4"/>
-              <w:right w:val="dotted" w:color="C8CDD2" w:sz="4"/>
+              <w:top w:val="single" w:color="555D66" w:sz="8"/>
+              <w:left w:val="single" w:color="555D66" w:sz="8"/>
+              <w:bottom w:val="single" w:color="555D66" w:sz="8"/>
+              <w:right w:val="single" w:color="555D66" w:sz="8"/>
             </w:tcBorders>
             <w:tcMar>
               <w:top w:type="dxa" w:w="60"/>
@@ -7961,10 +7961,10 @@
           <w:tcPr>
             <w:tcW w:type="dxa" w:w="7000"/>
             <w:tcBorders>
-              <w:top w:val="dotted" w:color="C8CDD2" w:sz="4"/>
-              <w:left w:val="dotted" w:color="C8CDD2" w:sz="4"/>
-              <w:bottom w:val="dotted" w:color="C8CDD2" w:sz="4"/>
-              <w:right w:val="dotted" w:color="C8CDD2" w:sz="4"/>
+              <w:top w:val="single" w:color="555D66" w:sz="8"/>
+              <w:left w:val="single" w:color="555D66" w:sz="8"/>
+              <w:bottom w:val="single" w:color="555D66" w:sz="8"/>
+              <w:right w:val="single" w:color="555D66" w:sz="8"/>
             </w:tcBorders>
             <w:tcMar>
               <w:top w:type="dxa" w:w="60"/>
@@ -7990,10 +7990,10 @@
           <w:tcPr>
             <w:tcW w:type="dxa" w:w="4200"/>
             <w:tcBorders>
-              <w:top w:val="dotted" w:color="C8CDD2" w:sz="4"/>
-              <w:left w:val="dotted" w:color="C8CDD2" w:sz="4"/>
-              <w:bottom w:val="dotted" w:color="C8CDD2" w:sz="4"/>
-              <w:right w:val="dotted" w:color="C8CDD2" w:sz="4"/>
+              <w:top w:val="single" w:color="555D66" w:sz="8"/>
+              <w:left w:val="single" w:color="555D66" w:sz="8"/>
+              <w:bottom w:val="single" w:color="555D66" w:sz="8"/>
+              <w:right w:val="single" w:color="555D66" w:sz="8"/>
             </w:tcBorders>
             <w:tcMar>
               <w:top w:type="dxa" w:w="60"/>
@@ -8019,10 +8019,10 @@
           <w:tcPr>
             <w:tcW w:type="dxa" w:w="4200"/>
             <w:tcBorders>
-              <w:top w:val="dotted" w:color="C8CDD2" w:sz="4"/>
-              <w:left w:val="dotted" w:color="C8CDD2" w:sz="4"/>
-              <w:bottom w:val="dotted" w:color="C8CDD2" w:sz="4"/>
-              <w:right w:val="dotted" w:color="C8CDD2" w:sz="4"/>
+              <w:top w:val="single" w:color="555D66" w:sz="8"/>
+              <w:left w:val="single" w:color="555D66" w:sz="8"/>
+              <w:bottom w:val="single" w:color="555D66" w:sz="8"/>
+              <w:right w:val="single" w:color="555D66" w:sz="8"/>
             </w:tcBorders>
             <w:tcMar>
               <w:top w:type="dxa" w:w="60"/>
@@ -8050,10 +8050,10 @@
           <w:tcPr>
             <w:tcW w:type="dxa" w:w="7000"/>
             <w:tcBorders>
-              <w:top w:val="dotted" w:color="C8CDD2" w:sz="4"/>
-              <w:left w:val="dotted" w:color="C8CDD2" w:sz="4"/>
-              <w:bottom w:val="dotted" w:color="C8CDD2" w:sz="4"/>
-              <w:right w:val="dotted" w:color="C8CDD2" w:sz="4"/>
+              <w:top w:val="single" w:color="555D66" w:sz="8"/>
+              <w:left w:val="single" w:color="555D66" w:sz="8"/>
+              <w:bottom w:val="single" w:color="555D66" w:sz="8"/>
+              <w:right w:val="single" w:color="555D66" w:sz="8"/>
             </w:tcBorders>
             <w:tcMar>
               <w:top w:type="dxa" w:w="60"/>
@@ -8079,10 +8079,10 @@
           <w:tcPr>
             <w:tcW w:type="dxa" w:w="4200"/>
             <w:tcBorders>
-              <w:top w:val="dotted" w:color="C8CDD2" w:sz="4"/>
-              <w:left w:val="dotted" w:color="C8CDD2" w:sz="4"/>
-              <w:bottom w:val="dotted" w:color="C8CDD2" w:sz="4"/>
-              <w:right w:val="dotted" w:color="C8CDD2" w:sz="4"/>
+              <w:top w:val="single" w:color="555D66" w:sz="8"/>
+              <w:left w:val="single" w:color="555D66" w:sz="8"/>
+              <w:bottom w:val="single" w:color="555D66" w:sz="8"/>
+              <w:right w:val="single" w:color="555D66" w:sz="8"/>
             </w:tcBorders>
             <w:tcMar>
               <w:top w:type="dxa" w:w="60"/>
@@ -8108,10 +8108,10 @@
           <w:tcPr>
             <w:tcW w:type="dxa" w:w="4200"/>
             <w:tcBorders>
-              <w:top w:val="dotted" w:color="C8CDD2" w:sz="4"/>
-              <w:left w:val="dotted" w:color="C8CDD2" w:sz="4"/>
-              <w:bottom w:val="dotted" w:color="C8CDD2" w:sz="4"/>
-              <w:right w:val="dotted" w:color="C8CDD2" w:sz="4"/>
+              <w:top w:val="single" w:color="555D66" w:sz="8"/>
+              <w:left w:val="single" w:color="555D66" w:sz="8"/>
+              <w:bottom w:val="single" w:color="555D66" w:sz="8"/>
+              <w:right w:val="single" w:color="555D66" w:sz="8"/>
             </w:tcBorders>
             <w:tcMar>
               <w:top w:type="dxa" w:w="60"/>
@@ -8139,10 +8139,10 @@
           <w:tcPr>
             <w:tcW w:type="dxa" w:w="7000"/>
             <w:tcBorders>
-              <w:top w:val="dotted" w:color="C8CDD2" w:sz="4"/>
-              <w:left w:val="dotted" w:color="C8CDD2" w:sz="4"/>
-              <w:bottom w:val="dotted" w:color="C8CDD2" w:sz="4"/>
-              <w:right w:val="dotted" w:color="C8CDD2" w:sz="4"/>
+              <w:top w:val="single" w:color="555D66" w:sz="8"/>
+              <w:left w:val="single" w:color="555D66" w:sz="8"/>
+              <w:bottom w:val="single" w:color="555D66" w:sz="8"/>
+              <w:right w:val="single" w:color="555D66" w:sz="8"/>
             </w:tcBorders>
             <w:tcMar>
               <w:top w:type="dxa" w:w="60"/>
@@ -8168,10 +8168,10 @@
           <w:tcPr>
             <w:tcW w:type="dxa" w:w="4200"/>
             <w:tcBorders>
-              <w:top w:val="dotted" w:color="C8CDD2" w:sz="4"/>
-              <w:left w:val="dotted" w:color="C8CDD2" w:sz="4"/>
-              <w:bottom w:val="dotted" w:color="C8CDD2" w:sz="4"/>
-              <w:right w:val="dotted" w:color="C8CDD2" w:sz="4"/>
+              <w:top w:val="single" w:color="555D66" w:sz="8"/>
+              <w:left w:val="single" w:color="555D66" w:sz="8"/>
+              <w:bottom w:val="single" w:color="555D66" w:sz="8"/>
+              <w:right w:val="single" w:color="555D66" w:sz="8"/>
             </w:tcBorders>
             <w:tcMar>
               <w:top w:type="dxa" w:w="60"/>
@@ -8197,10 +8197,10 @@
           <w:tcPr>
             <w:tcW w:type="dxa" w:w="4200"/>
             <w:tcBorders>
-              <w:top w:val="dotted" w:color="C8CDD2" w:sz="4"/>
-              <w:left w:val="dotted" w:color="C8CDD2" w:sz="4"/>
-              <w:bottom w:val="dotted" w:color="C8CDD2" w:sz="4"/>
-              <w:right w:val="dotted" w:color="C8CDD2" w:sz="4"/>
+              <w:top w:val="single" w:color="555D66" w:sz="8"/>
+              <w:left w:val="single" w:color="555D66" w:sz="8"/>
+              <w:bottom w:val="single" w:color="555D66" w:sz="8"/>
+              <w:right w:val="single" w:color="555D66" w:sz="8"/>
             </w:tcBorders>
             <w:tcMar>
               <w:top w:type="dxa" w:w="60"/>
@@ -8228,10 +8228,10 @@
           <w:tcPr>
             <w:tcW w:type="dxa" w:w="7000"/>
             <w:tcBorders>
-              <w:top w:val="dotted" w:color="C8CDD2" w:sz="4"/>
-              <w:left w:val="dotted" w:color="C8CDD2" w:sz="4"/>
-              <w:bottom w:val="dotted" w:color="C8CDD2" w:sz="4"/>
-              <w:right w:val="dotted" w:color="C8CDD2" w:sz="4"/>
+              <w:top w:val="single" w:color="555D66" w:sz="8"/>
+              <w:left w:val="single" w:color="555D66" w:sz="8"/>
+              <w:bottom w:val="single" w:color="555D66" w:sz="8"/>
+              <w:right w:val="single" w:color="555D66" w:sz="8"/>
             </w:tcBorders>
             <w:tcMar>
               <w:top w:type="dxa" w:w="60"/>
@@ -8257,10 +8257,10 @@
           <w:tcPr>
             <w:tcW w:type="dxa" w:w="4200"/>
             <w:tcBorders>
-              <w:top w:val="dotted" w:color="C8CDD2" w:sz="4"/>
-              <w:left w:val="dotted" w:color="C8CDD2" w:sz="4"/>
-              <w:bottom w:val="dotted" w:color="C8CDD2" w:sz="4"/>
-              <w:right w:val="dotted" w:color="C8CDD2" w:sz="4"/>
+              <w:top w:val="single" w:color="555D66" w:sz="8"/>
+              <w:left w:val="single" w:color="555D66" w:sz="8"/>
+              <w:bottom w:val="single" w:color="555D66" w:sz="8"/>
+              <w:right w:val="single" w:color="555D66" w:sz="8"/>
             </w:tcBorders>
             <w:tcMar>
               <w:top w:type="dxa" w:w="60"/>
@@ -8286,10 +8286,10 @@
           <w:tcPr>
             <w:tcW w:type="dxa" w:w="4200"/>
             <w:tcBorders>
-              <w:top w:val="dotted" w:color="C8CDD2" w:sz="4"/>
-              <w:left w:val="dotted" w:color="C8CDD2" w:sz="4"/>
-              <w:bottom w:val="dotted" w:color="C8CDD2" w:sz="4"/>
-              <w:right w:val="dotted" w:color="C8CDD2" w:sz="4"/>
+              <w:top w:val="single" w:color="555D66" w:sz="8"/>
+              <w:left w:val="single" w:color="555D66" w:sz="8"/>
+              <w:bottom w:val="single" w:color="555D66" w:sz="8"/>
+              <w:right w:val="single" w:color="555D66" w:sz="8"/>
             </w:tcBorders>
             <w:tcMar>
               <w:top w:type="dxa" w:w="60"/>
@@ -8317,10 +8317,10 @@
           <w:tcPr>
             <w:tcW w:type="dxa" w:w="7000"/>
             <w:tcBorders>
-              <w:top w:val="dotted" w:color="C8CDD2" w:sz="4"/>
-              <w:left w:val="dotted" w:color="C8CDD2" w:sz="4"/>
-              <w:bottom w:val="dotted" w:color="C8CDD2" w:sz="4"/>
-              <w:right w:val="dotted" w:color="C8CDD2" w:sz="4"/>
+              <w:top w:val="single" w:color="555D66" w:sz="8"/>
+              <w:left w:val="single" w:color="555D66" w:sz="8"/>
+              <w:bottom w:val="single" w:color="555D66" w:sz="8"/>
+              <w:right w:val="single" w:color="555D66" w:sz="8"/>
             </w:tcBorders>
             <w:tcMar>
               <w:top w:type="dxa" w:w="60"/>
@@ -8346,10 +8346,10 @@
           <w:tcPr>
             <w:tcW w:type="dxa" w:w="4200"/>
             <w:tcBorders>
-              <w:top w:val="dotted" w:color="C8CDD2" w:sz="4"/>
-              <w:left w:val="dotted" w:color="C8CDD2" w:sz="4"/>
-              <w:bottom w:val="dotted" w:color="C8CDD2" w:sz="4"/>
-              <w:right w:val="dotted" w:color="C8CDD2" w:sz="4"/>
+              <w:top w:val="single" w:color="555D66" w:sz="8"/>
+              <w:left w:val="single" w:color="555D66" w:sz="8"/>
+              <w:bottom w:val="single" w:color="555D66" w:sz="8"/>
+              <w:right w:val="single" w:color="555D66" w:sz="8"/>
             </w:tcBorders>
             <w:tcMar>
               <w:top w:type="dxa" w:w="60"/>
@@ -8375,10 +8375,10 @@
           <w:tcPr>
             <w:tcW w:type="dxa" w:w="4200"/>
             <w:tcBorders>
-              <w:top w:val="dotted" w:color="C8CDD2" w:sz="4"/>
-              <w:left w:val="dotted" w:color="C8CDD2" w:sz="4"/>
-              <w:bottom w:val="dotted" w:color="C8CDD2" w:sz="4"/>
-              <w:right w:val="dotted" w:color="C8CDD2" w:sz="4"/>
+              <w:top w:val="single" w:color="555D66" w:sz="8"/>
+              <w:left w:val="single" w:color="555D66" w:sz="8"/>
+              <w:bottom w:val="single" w:color="555D66" w:sz="8"/>
+              <w:right w:val="single" w:color="555D66" w:sz="8"/>
             </w:tcBorders>
             <w:tcMar>
               <w:top w:type="dxa" w:w="60"/>
@@ -8406,10 +8406,10 @@
           <w:tcPr>
             <w:tcW w:type="dxa" w:w="7000"/>
             <w:tcBorders>
-              <w:top w:val="dotted" w:color="C8CDD2" w:sz="4"/>
-              <w:left w:val="dotted" w:color="C8CDD2" w:sz="4"/>
-              <w:bottom w:val="dotted" w:color="C8CDD2" w:sz="4"/>
-              <w:right w:val="dotted" w:color="C8CDD2" w:sz="4"/>
+              <w:top w:val="single" w:color="555D66" w:sz="8"/>
+              <w:left w:val="single" w:color="555D66" w:sz="8"/>
+              <w:bottom w:val="single" w:color="555D66" w:sz="8"/>
+              <w:right w:val="single" w:color="555D66" w:sz="8"/>
             </w:tcBorders>
             <w:tcMar>
               <w:top w:type="dxa" w:w="60"/>
@@ -8435,10 +8435,10 @@
           <w:tcPr>
             <w:tcW w:type="dxa" w:w="4200"/>
             <w:tcBorders>
-              <w:top w:val="dotted" w:color="C8CDD2" w:sz="4"/>
-              <w:left w:val="dotted" w:color="C8CDD2" w:sz="4"/>
-              <w:bottom w:val="dotted" w:color="C8CDD2" w:sz="4"/>
-              <w:right w:val="dotted" w:color="C8CDD2" w:sz="4"/>
+              <w:top w:val="single" w:color="555D66" w:sz="8"/>
+              <w:left w:val="single" w:color="555D66" w:sz="8"/>
+              <w:bottom w:val="single" w:color="555D66" w:sz="8"/>
+              <w:right w:val="single" w:color="555D66" w:sz="8"/>
             </w:tcBorders>
             <w:tcMar>
               <w:top w:type="dxa" w:w="60"/>
@@ -8464,10 +8464,10 @@
           <w:tcPr>
             <w:tcW w:type="dxa" w:w="4200"/>
             <w:tcBorders>
-              <w:top w:val="dotted" w:color="C8CDD2" w:sz="4"/>
-              <w:left w:val="dotted" w:color="C8CDD2" w:sz="4"/>
-              <w:bottom w:val="dotted" w:color="C8CDD2" w:sz="4"/>
-              <w:right w:val="dotted" w:color="C8CDD2" w:sz="4"/>
+              <w:top w:val="single" w:color="555D66" w:sz="8"/>
+              <w:left w:val="single" w:color="555D66" w:sz="8"/>
+              <w:bottom w:val="single" w:color="555D66" w:sz="8"/>
+              <w:right w:val="single" w:color="555D66" w:sz="8"/>
             </w:tcBorders>
             <w:tcMar>
               <w:top w:type="dxa" w:w="60"/>
@@ -8495,10 +8495,10 @@
           <w:tcPr>
             <w:tcW w:type="dxa" w:w="7000"/>
             <w:tcBorders>
-              <w:top w:val="dotted" w:color="C8CDD2" w:sz="4"/>
-              <w:left w:val="dotted" w:color="C8CDD2" w:sz="4"/>
-              <w:bottom w:val="dotted" w:color="C8CDD2" w:sz="4"/>
-              <w:right w:val="dotted" w:color="C8CDD2" w:sz="4"/>
+              <w:top w:val="single" w:color="555D66" w:sz="8"/>
+              <w:left w:val="single" w:color="555D66" w:sz="8"/>
+              <w:bottom w:val="single" w:color="555D66" w:sz="8"/>
+              <w:right w:val="single" w:color="555D66" w:sz="8"/>
             </w:tcBorders>
             <w:tcMar>
               <w:top w:type="dxa" w:w="60"/>
@@ -8524,10 +8524,10 @@
           <w:tcPr>
             <w:tcW w:type="dxa" w:w="4200"/>
             <w:tcBorders>
-              <w:top w:val="dotted" w:color="C8CDD2" w:sz="4"/>
-              <w:left w:val="dotted" w:color="C8CDD2" w:sz="4"/>
-              <w:bottom w:val="dotted" w:color="C8CDD2" w:sz="4"/>
-              <w:right w:val="dotted" w:color="C8CDD2" w:sz="4"/>
+              <w:top w:val="single" w:color="555D66" w:sz="8"/>
+              <w:left w:val="single" w:color="555D66" w:sz="8"/>
+              <w:bottom w:val="single" w:color="555D66" w:sz="8"/>
+              <w:right w:val="single" w:color="555D66" w:sz="8"/>
             </w:tcBorders>
             <w:tcMar>
               <w:top w:type="dxa" w:w="60"/>
@@ -8553,10 +8553,10 @@
           <w:tcPr>
             <w:tcW w:type="dxa" w:w="4200"/>
             <w:tcBorders>
-              <w:top w:val="dotted" w:color="C8CDD2" w:sz="4"/>
-              <w:left w:val="dotted" w:color="C8CDD2" w:sz="4"/>
-              <w:bottom w:val="dotted" w:color="C8CDD2" w:sz="4"/>
-              <w:right w:val="dotted" w:color="C8CDD2" w:sz="4"/>
+              <w:top w:val="single" w:color="555D66" w:sz="8"/>
+              <w:left w:val="single" w:color="555D66" w:sz="8"/>
+              <w:bottom w:val="single" w:color="555D66" w:sz="8"/>
+              <w:right w:val="single" w:color="555D66" w:sz="8"/>
             </w:tcBorders>
             <w:tcMar>
               <w:top w:type="dxa" w:w="60"/>
@@ -8584,10 +8584,10 @@
           <w:tcPr>
             <w:tcW w:type="dxa" w:w="7000"/>
             <w:tcBorders>
-              <w:top w:val="dotted" w:color="C8CDD2" w:sz="4"/>
-              <w:left w:val="dotted" w:color="C8CDD2" w:sz="4"/>
-              <w:bottom w:val="dotted" w:color="C8CDD2" w:sz="4"/>
-              <w:right w:val="dotted" w:color="C8CDD2" w:sz="4"/>
+              <w:top w:val="single" w:color="555D66" w:sz="8"/>
+              <w:left w:val="single" w:color="555D66" w:sz="8"/>
+              <w:bottom w:val="single" w:color="555D66" w:sz="8"/>
+              <w:right w:val="single" w:color="555D66" w:sz="8"/>
             </w:tcBorders>
             <w:tcMar>
               <w:top w:type="dxa" w:w="60"/>
@@ -8613,10 +8613,10 @@
           <w:tcPr>
             <w:tcW w:type="dxa" w:w="4200"/>
             <w:tcBorders>
-              <w:top w:val="dotted" w:color="C8CDD2" w:sz="4"/>
-              <w:left w:val="dotted" w:color="C8CDD2" w:sz="4"/>
-              <w:bottom w:val="dotted" w:color="C8CDD2" w:sz="4"/>
-              <w:right w:val="dotted" w:color="C8CDD2" w:sz="4"/>
+              <w:top w:val="single" w:color="555D66" w:sz="8"/>
+              <w:left w:val="single" w:color="555D66" w:sz="8"/>
+              <w:bottom w:val="single" w:color="555D66" w:sz="8"/>
+              <w:right w:val="single" w:color="555D66" w:sz="8"/>
             </w:tcBorders>
             <w:tcMar>
               <w:top w:type="dxa" w:w="60"/>
@@ -8642,10 +8642,10 @@
           <w:tcPr>
             <w:tcW w:type="dxa" w:w="4200"/>
             <w:tcBorders>
-              <w:top w:val="dotted" w:color="C8CDD2" w:sz="4"/>
-              <w:left w:val="dotted" w:color="C8CDD2" w:sz="4"/>
-              <w:bottom w:val="dotted" w:color="C8CDD2" w:sz="4"/>
-              <w:right w:val="dotted" w:color="C8CDD2" w:sz="4"/>
+              <w:top w:val="single" w:color="555D66" w:sz="8"/>
+              <w:left w:val="single" w:color="555D66" w:sz="8"/>
+              <w:bottom w:val="single" w:color="555D66" w:sz="8"/>
+              <w:right w:val="single" w:color="555D66" w:sz="8"/>
             </w:tcBorders>
             <w:tcMar>
               <w:top w:type="dxa" w:w="60"/>
@@ -8673,10 +8673,10 @@
           <w:tcPr>
             <w:tcW w:type="dxa" w:w="7000"/>
             <w:tcBorders>
-              <w:top w:val="dotted" w:color="C8CDD2" w:sz="4"/>
-              <w:left w:val="dotted" w:color="C8CDD2" w:sz="4"/>
-              <w:bottom w:val="dotted" w:color="C8CDD2" w:sz="4"/>
-              <w:right w:val="dotted" w:color="C8CDD2" w:sz="4"/>
+              <w:top w:val="single" w:color="555D66" w:sz="8"/>
+              <w:left w:val="single" w:color="555D66" w:sz="8"/>
+              <w:bottom w:val="single" w:color="555D66" w:sz="8"/>
+              <w:right w:val="single" w:color="555D66" w:sz="8"/>
             </w:tcBorders>
             <w:tcMar>
               <w:top w:type="dxa" w:w="60"/>
@@ -8702,10 +8702,10 @@
           <w:tcPr>
             <w:tcW w:type="dxa" w:w="4200"/>
             <w:tcBorders>
-              <w:top w:val="dotted" w:color="C8CDD2" w:sz="4"/>
-              <w:left w:val="dotted" w:color="C8CDD2" w:sz="4"/>
-              <w:bottom w:val="dotted" w:color="C8CDD2" w:sz="4"/>
-              <w:right w:val="dotted" w:color="C8CDD2" w:sz="4"/>
+              <w:top w:val="single" w:color="555D66" w:sz="8"/>
+              <w:left w:val="single" w:color="555D66" w:sz="8"/>
+              <w:bottom w:val="single" w:color="555D66" w:sz="8"/>
+              <w:right w:val="single" w:color="555D66" w:sz="8"/>
             </w:tcBorders>
             <w:tcMar>
               <w:top w:type="dxa" w:w="60"/>
@@ -8731,10 +8731,10 @@
           <w:tcPr>
             <w:tcW w:type="dxa" w:w="4200"/>
             <w:tcBorders>
-              <w:top w:val="dotted" w:color="C8CDD2" w:sz="4"/>
-              <w:left w:val="dotted" w:color="C8CDD2" w:sz="4"/>
-              <w:bottom w:val="dotted" w:color="C8CDD2" w:sz="4"/>
-              <w:right w:val="dotted" w:color="C8CDD2" w:sz="4"/>
+              <w:top w:val="single" w:color="555D66" w:sz="8"/>
+              <w:left w:val="single" w:color="555D66" w:sz="8"/>
+              <w:bottom w:val="single" w:color="555D66" w:sz="8"/>
+              <w:right w:val="single" w:color="555D66" w:sz="8"/>
             </w:tcBorders>
             <w:tcMar>
               <w:top w:type="dxa" w:w="60"/>

</xml_diff>